<commit_message>
docs: How we did it covers the last morning: renamed prompts, summary-first answers, public GitHub Pages copy, the deck and its skeptic reviews; current index counts; new wrong-AI case and two lessons
Co-Authored-By: Claude Opus 5.5 <noreply@anthropic.com>
</commit_message>
<xml_diff>
--- a/docs/how_we_did_it/Needle_in_the_Haystack_How_We_Did_It.docx
+++ b/docs/how_we_did_it/Needle_in_the_Haystack_How_We_Did_It.docx
@@ -66,7 +66,7 @@
         <w:pBdr>
           <w:bottom w:val="single" w:color="D97757" w:sz="6" w:space="1"/>
         </w:pBdr>
-        <w:spacing w:before="160" w:after="280"/>
+        <w:spacing w:after="280" w:before="160"/>
       </w:pPr>
     </w:p>
     <w:p>
@@ -94,7 +94,7 @@
           <w:sz w:val="21"/>
           <w:szCs w:val="21"/>
         </w:rPr>
-        <w:t xml:space="preserve">The deliverable is a chat page with two prompts, both taken verbatim from the case. The first returns a five-finding table, a Sharpest Needle and a product fine-print comparison for Amgen, Merck or Pfizer. The second returns one strategic move for the next 24 months with a budget, the math, two rejected alternatives and the signals that would prove it wrong. Every figure on the page carries a footnote that opens the source document at the cited page.</w:t>
+        <w:t xml:space="preserve">The deliverable is a chat page with two prompts, both taken verbatim from the case and labelled Find the needle and The CEO Move. The first returns a five-finding table, a Sharpest Needle and a product fine-print comparison for Amgen, Merck or Pfizer. The second returns one strategic move for the next 24 months with a budget, the math, two rejected alternatives and the signals that would prove it wrong. Every figure on the page carries a footnote that opens the source document at the cited page. Anyone can open it, with no login, at aidanmcjones.github.io/needle-demo, and a seven-slide deck sets it up for a three-to-five-minute pitch.</w:t>
       </w:r>
     </w:p>
     <w:p>
@@ -108,7 +108,7 @@
           <w:sz w:val="21"/>
           <w:szCs w:val="21"/>
         </w:rPr>
-        <w:t xml:space="preserve">This report covers the tools we used and what each was for, how documents reached the AI and how the work was split between people and tools, the prompts that mattered most, the cases where the AI was confidently wrong, and what we would do differently. We logged 542 of those wrong cases. A person reading a page caught the ones that taught us the most.</w:t>
+        <w:t xml:space="preserve">This report covers the tools we used and what each was for, how documents reached the AI and how the work was split between people and tools, the prompts that mattered most, the cases where the AI was confidently wrong, and what we would do differently. We logged 543 of those wrong cases. A person reading a page caught the ones that taught us the most.</w:t>
       </w:r>
     </w:p>
     <w:p>
@@ -176,7 +176,7 @@
                 <w:sz w:val="15"/>
                 <w:szCs w:val="15"/>
               </w:rPr>
-              <w:t xml:space="preserve">pages in the citation index, from 7,003 documents and 117,904 fact rows</w:t>
+              <w:t xml:space="preserve">pages in the citation index, from 7,005 documents and 118,329 fact rows</w:t>
             </w:r>
           </w:p>
         </w:tc>
@@ -297,7 +297,7 @@
                 <w:sz w:val="34"/>
                 <w:szCs w:val="34"/>
               </w:rPr>
-              <w:t xml:space="preserve">542</w:t>
+              <w:t xml:space="preserve">543</w:t>
             </w:r>
           </w:p>
           <w:p>
@@ -325,170 +325,13 @@
     <w:p>
       <w:pPr>
         <w:keepNext/>
-        <w:spacing w:before="140" w:after="80"/>
+        <w:spacing w:after="80" w:before="140"/>
         <w:jc w:val="center"/>
       </w:pPr>
       <w:r>
         <w:drawing>
           <wp:inline distT="0" distB="0" distL="0" distR="0">
             <wp:extent cx="5962650" cy="742950"/>
-            <wp:effectExtent t="0" r="0" b="0" l="0"/>
-            <wp:docPr id="1" name="" descr="" title=""/>
-            <wp:cNvGraphicFramePr>
-              <a:graphicFrameLocks xmlns:a="http://schemas.openxmlformats.org/drawingml/2006/main" noChangeAspect="1"/>
-            </wp:cNvGraphicFramePr>
-            <a:graphic xmlns:a="http://schemas.openxmlformats.org/drawingml/2006/main">
-              <a:graphicData uri="http://schemas.openxmlformats.org/drawingml/2006/picture">
-                <pic:pic xmlns:pic="http://schemas.openxmlformats.org/drawingml/2006/picture">
-                  <pic:nvPicPr>
-                    <pic:cNvPr id="0" name="" descr=""/>
-                    <pic:cNvPicPr>
-                      <a:picLocks noChangeAspect="1" noChangeArrowheads="1"/>
-                    </pic:cNvPicPr>
-                  </pic:nvPicPr>
-                  <pic:blipFill>
-                    <a:blip r:embed="rId7" cstate="none"/>
-                    <a:srcRect/>
-                    <a:stretch>
-                      <a:fillRect/>
-                    </a:stretch>
-                  </pic:blipFill>
-                  <pic:spPr bwMode="auto">
-                    <a:xfrm>
-                      <a:off x="0" y="0"/>
-                      <a:ext cx="5962650" cy="742950"/>
-                    </a:xfrm>
-                    <a:prstGeom prst="rect">
-                      <a:avLst/>
-                    </a:prstGeom>
-                  </pic:spPr>
-                </pic:pic>
-              </a:graphicData>
-            </a:graphic>
-          </wp:inline>
-        </w:drawing>
-      </w:r>
-    </w:p>
-    <w:p>
-      <w:pPr>
-        <w:spacing w:after="220"/>
-        <w:jc w:val="left"/>
-      </w:pPr>
-      <w:r>
-        <w:rPr>
-          <w:rFonts w:ascii="Arial" w:cs="Arial" w:eastAsia="Arial" w:hAnsi="Arial"/>
-          <w:color w:val="5E5D59"/>
-          <w:sz w:val="17"/>
-          <w:szCs w:val="17"/>
-        </w:rPr>
-        <w:t xml:space="preserve">Figure 1. The weekend, Central Time. The case was released Saturday morning. The blind Part 1 pass ran Saturday night, and Part 2 after midnight.</w:t>
-      </w:r>
-    </w:p>
-    <w:p>
-      <w:pPr>
-        <w:pStyle w:val="Heading1"/>
-        <w:spacing w:before="520" w:after="200"/>
-      </w:pPr>
-      <w:r>
-        <w:rPr>
-          <w:rFonts w:ascii="Georgia" w:cs="Georgia" w:eastAsia="Georgia" w:hAnsi="Georgia"/>
-          <w:color w:val="141413"/>
-          <w:sz w:val="38"/>
-          <w:szCs w:val="38"/>
-        </w:rPr>
-        <w:t xml:space="preserve">1. What the case asked, and the two traps in it</w:t>
-      </w:r>
-    </w:p>
-    <w:p>
-      <w:pPr>
-        <w:spacing w:after="160" w:line="300"/>
-      </w:pPr>
-      <w:r>
-        <w:rPr>
-          <w:rFonts w:ascii="Arial" w:cs="Arial" w:eastAsia="Arial" w:hAnsi="Arial"/>
-          <w:color w:val="141413"/>
-          <w:sz w:val="21"/>
-          <w:szCs w:val="21"/>
-        </w:rPr>
-        <w:t xml:space="preserve">The Fine Print asks for two things. Part 1: pick one of ten drugmakers and find at least five findings that would change an investor's view and are not obvious, each with impact math, a peer comparison and a confidence call, plus the single sharpest one and a side-by-side of one product against the rivals the case names. Part 2: take the CEO's seat and recommend one move for the next 24 months with a budget or a commitment of people, the math, the two strongest rejected alternatives, and measurable kill signals in months six to twelve.</w:t>
-      </w:r>
-    </w:p>
-    <w:p>
-      <w:pPr>
-        <w:spacing w:after="160" w:line="300"/>
-      </w:pPr>
-      <w:r>
-        <w:rPr>
-          <w:rFonts w:ascii="Arial" w:cs="Arial" w:eastAsia="Arial" w:hAnsi="Arial"/>
-          <w:color w:val="141413"/>
-          <w:sz w:val="21"/>
-          <w:szCs w:val="21"/>
-        </w:rPr>
-        <w:t xml:space="preserve">The case also names the two ways AI fails at this. On Part 1, a model will surface things management has already said plainly, such as the patent cliff, the press-release headline and the starter thread. On Part 2, as the case puts it, AI will argue convincingly for almost any strategy. We treated both as design constraints.</w:t>
-      </w:r>
-    </w:p>
-    <w:p>
-      <w:pPr>
-        <w:pBdr>
-          <w:left w:val="single" w:color="D97757" w:sz="18" w:space="12"/>
-        </w:pBdr>
-        <w:spacing w:before="60" w:after="60" w:line="320"/>
-        <w:ind w:left="360" w:right="720"/>
-      </w:pPr>
-      <w:r>
-        <w:rPr>
-          <w:rFonts w:ascii="Georgia" w:cs="Georgia" w:eastAsia="Georgia" w:hAnsi="Georgia"/>
-          <w:i/>
-          <w:iCs/>
-          <w:color w:val="141413"/>
-          <w:sz w:val="25"/>
-          <w:szCs w:val="25"/>
-        </w:rPr>
-        <w:t xml:space="preserve">Every number you see was computed by deterministic code from a cited page. AI writes the words, argues the case and reads the calls, and nothing it says reaches the screen until a verifier has found it on the page it cites. When the AI was wrong, and it was, that is how we caught it.</w:t>
-      </w:r>
-    </w:p>
-    <w:p>
-      <w:pPr>
-        <w:pBdr>
-          <w:left w:val="single" w:color="D97757" w:sz="18" w:space="12"/>
-        </w:pBdr>
-        <w:spacing w:after="200"/>
-        <w:ind w:left="360" w:right="720"/>
-      </w:pPr>
-      <w:r>
-        <w:rPr>
-          <w:rFonts w:ascii="Arial" w:cs="Arial" w:eastAsia="Arial" w:hAnsi="Arial"/>
-          <w:color w:val="5E5D59"/>
-          <w:sz w:val="17"/>
-          <w:szCs w:val="17"/>
-        </w:rPr>
-        <w:t xml:space="preserve">The line we built the system around</w:t>
-      </w:r>
-    </w:p>
-    <w:p>
-      <w:pPr>
-        <w:spacing w:after="160" w:line="300"/>
-      </w:pPr>
-      <w:r>
-        <w:rPr>
-          <w:rFonts w:ascii="Arial" w:cs="Arial" w:eastAsia="Arial" w:hAnsi="Arial"/>
-          <w:color w:val="141413"/>
-          <w:sz w:val="21"/>
-          <w:szCs w:val="21"/>
-        </w:rPr>
-        <w:t xml:space="preserve">We worked to three rules. First, code fetches and verifies. Scripts collect every source into a page-marked index, nothing is pasted into a chat, and every quote is checked by exact match on its page. Second, agents reason blind and against each other. The readers who look for findings cannot see any prior run, and every candidate must survive two skeptics who read each other's arguments. Third, people decide. A person opened the cited page behind every needle before it reached a slide, and the company pick rests on that read.</w:t>
-      </w:r>
-    </w:p>
-    <w:p>
-      <w:pPr>
-        <w:keepNext/>
-        <w:spacing w:before="140" w:after="80"/>
-        <w:jc w:val="center"/>
-      </w:pPr>
-      <w:r>
-        <w:drawing>
-          <wp:inline distT="0" distB="0" distL="0" distR="0">
-            <wp:extent cx="6124575" cy="1857375"/>
             <wp:effectExtent t="0" r="0" b="0" l="0"/>
             <wp:docPr id="1" name="" descr="" title=""/>
             <wp:cNvGraphicFramePr>
@@ -513,7 +356,7 @@
                   <pic:spPr bwMode="auto">
                     <a:xfrm>
                       <a:off x="0" y="0"/>
-                      <a:ext cx="6124575" cy="1857375"/>
+                      <a:ext cx="5962650" cy="742950"/>
                     </a:xfrm>
                     <a:prstGeom prst="rect">
                       <a:avLst/>
@@ -538,13 +381,13 @@
           <w:sz w:val="17"/>
           <w:szCs w:val="17"/>
         </w:rPr>
-        <w:t xml:space="preserve">Figure 2. The system at a glance. Sources flow left to right. People and a watcher session sit alongside the two stages where judgment happens.</w:t>
+        <w:t xml:space="preserve">Figure 1. The weekend, Central Time. The case was released Saturday morning. The blind Part 1 pass ran Saturday night, and Part 2 after midnight.</w:t>
       </w:r>
     </w:p>
     <w:p>
       <w:pPr>
         <w:pStyle w:val="Heading1"/>
-        <w:spacing w:before="520" w:after="200"/>
+        <w:spacing w:after="200" w:before="520"/>
       </w:pPr>
       <w:r>
         <w:rPr>
@@ -553,7 +396,7 @@
           <w:sz w:val="38"/>
           <w:szCs w:val="38"/>
         </w:rPr>
-        <w:t xml:space="preserve">2. The tools and what each was for</w:t>
+        <w:t xml:space="preserve">1. What the case asked, and the two traps in it</w:t>
       </w:r>
     </w:p>
     <w:p>
@@ -567,1006 +410,7 @@
           <w:sz w:val="21"/>
           <w:szCs w:val="21"/>
         </w:rPr>
-        <w:t xml:space="preserve">We used one model family for every reasoning step and ordinary engineering for everything else. No model wrote a number into the deliverable. Models proposed findings, argued over them and verified them. Code decided what could be shown.</w:t>
-      </w:r>
-    </w:p>
-    <w:tbl>
-      <w:tblPr>
-        <w:tblW w:type="dxa" w:w="9648"/>
-        <w:tblBorders>
-          <w:top w:val="single" w:color="auto" w:sz="4"/>
-          <w:left w:val="single" w:color="auto" w:sz="4"/>
-          <w:bottom w:val="single" w:color="auto" w:sz="4"/>
-          <w:right w:val="single" w:color="auto" w:sz="4"/>
-          <w:insideH w:val="single" w:color="auto" w:sz="4"/>
-          <w:insideV w:val="single" w:color="auto" w:sz="4"/>
-        </w:tblBorders>
-      </w:tblPr>
-      <w:tblGrid>
-        <w:gridCol w:w="3024"/>
-        <w:gridCol w:w="6624"/>
-      </w:tblGrid>
-      <w:tr>
-        <w:trPr>
-          <w:tblHeader/>
-        </w:trPr>
-        <w:tc>
-          <w:tcPr>
-            <w:tcW w:type="dxa" w:w="3024"/>
-            <w:tcBorders>
-              <w:top w:val="single" w:color="D9D6CE" w:sz="4"/>
-              <w:left w:val="none" w:color="FFFFFF" w:sz="0"/>
-              <w:bottom w:val="single" w:color="D9D6CE" w:sz="4"/>
-              <w:right w:val="none" w:color="FFFFFF" w:sz="0"/>
-            </w:tcBorders>
-            <w:shd w:fill="F0EEE6" w:color="auto" w:val="clear"/>
-            <w:tcMar>
-              <w:top w:type="dxa" w:w="70"/>
-              <w:left w:type="dxa" w:w="90"/>
-              <w:bottom w:type="dxa" w:w="70"/>
-              <w:right w:type="dxa" w:w="90"/>
-            </w:tcMar>
-            <w:vAlign w:val="top"/>
-          </w:tcPr>
-          <w:p>
-            <w:pPr>
-              <w:spacing w:after="0" w:line="250"/>
-            </w:pPr>
-            <w:r>
-              <w:rPr>
-                <w:rFonts w:ascii="Arial" w:cs="Arial" w:eastAsia="Arial" w:hAnsi="Arial"/>
-                <w:b/>
-                <w:bCs/>
-                <w:color w:val="141413"/>
-                <w:sz w:val="17"/>
-                <w:szCs w:val="17"/>
-              </w:rPr>
-              <w:t xml:space="preserve">Tool</w:t>
-            </w:r>
-          </w:p>
-        </w:tc>
-        <w:tc>
-          <w:tcPr>
-            <w:tcW w:type="dxa" w:w="6624"/>
-            <w:tcBorders>
-              <w:top w:val="single" w:color="D9D6CE" w:sz="4"/>
-              <w:left w:val="none" w:color="FFFFFF" w:sz="0"/>
-              <w:bottom w:val="single" w:color="D9D6CE" w:sz="4"/>
-              <w:right w:val="none" w:color="FFFFFF" w:sz="0"/>
-            </w:tcBorders>
-            <w:shd w:fill="F0EEE6" w:color="auto" w:val="clear"/>
-            <w:tcMar>
-              <w:top w:type="dxa" w:w="70"/>
-              <w:left w:type="dxa" w:w="90"/>
-              <w:bottom w:type="dxa" w:w="70"/>
-              <w:right w:type="dxa" w:w="90"/>
-            </w:tcMar>
-            <w:vAlign w:val="top"/>
-          </w:tcPr>
-          <w:p>
-            <w:pPr>
-              <w:spacing w:after="0" w:line="250"/>
-            </w:pPr>
-            <w:r>
-              <w:rPr>
-                <w:rFonts w:ascii="Arial" w:cs="Arial" w:eastAsia="Arial" w:hAnsi="Arial"/>
-                <w:b/>
-                <w:bCs/>
-                <w:color w:val="141413"/>
-                <w:sz w:val="17"/>
-                <w:szCs w:val="17"/>
-              </w:rPr>
-              <w:t xml:space="preserve">What it was for</w:t>
-            </w:r>
-          </w:p>
-        </w:tc>
-      </w:tr>
-      <w:tr>
-        <w:trPr>
-          <w:cantSplit/>
-        </w:trPr>
-        <w:tc>
-          <w:tcPr>
-            <w:tcW w:type="dxa" w:w="3024"/>
-            <w:tcBorders>
-              <w:top w:val="single" w:color="D9D6CE" w:sz="4"/>
-              <w:left w:val="none" w:color="FFFFFF" w:sz="0"/>
-              <w:bottom w:val="single" w:color="D9D6CE" w:sz="4"/>
-              <w:right w:val="none" w:color="FFFFFF" w:sz="0"/>
-            </w:tcBorders>
-            <w:tcMar>
-              <w:top w:type="dxa" w:w="70"/>
-              <w:left w:type="dxa" w:w="90"/>
-              <w:bottom w:type="dxa" w:w="70"/>
-              <w:right w:type="dxa" w:w="90"/>
-            </w:tcMar>
-            <w:vAlign w:val="top"/>
-          </w:tcPr>
-          <w:p>
-            <w:pPr>
-              <w:spacing w:after="0" w:line="250"/>
-            </w:pPr>
-            <w:r>
-              <w:rPr>
-                <w:rFonts w:ascii="Arial" w:cs="Arial" w:eastAsia="Arial" w:hAnsi="Arial"/>
-                <w:b w:val="false"/>
-                <w:bCs w:val="false"/>
-                <w:color w:val="141413"/>
-                <w:sz w:val="17"/>
-                <w:szCs w:val="17"/>
-              </w:rPr>
-              <w:t xml:space="preserve">Claude Code with Claude Opus 5.5</w:t>
-            </w:r>
-          </w:p>
-        </w:tc>
-        <w:tc>
-          <w:tcPr>
-            <w:tcW w:type="dxa" w:w="6624"/>
-            <w:tcBorders>
-              <w:top w:val="single" w:color="D9D6CE" w:sz="4"/>
-              <w:left w:val="none" w:color="FFFFFF" w:sz="0"/>
-              <w:bottom w:val="single" w:color="D9D6CE" w:sz="4"/>
-              <w:right w:val="none" w:color="FFFFFF" w:sz="0"/>
-            </w:tcBorders>
-            <w:tcMar>
-              <w:top w:type="dxa" w:w="70"/>
-              <w:left w:type="dxa" w:w="90"/>
-              <w:bottom w:type="dxa" w:w="70"/>
-              <w:right w:type="dxa" w:w="90"/>
-            </w:tcMar>
-            <w:vAlign w:val="top"/>
-          </w:tcPr>
-          <w:p>
-            <w:pPr>
-              <w:spacing w:after="0" w:line="250"/>
-            </w:pPr>
-            <w:r>
-              <w:rPr>
-                <w:rFonts w:ascii="Arial" w:cs="Arial" w:eastAsia="Arial" w:hAnsi="Arial"/>
-                <w:b w:val="false"/>
-                <w:bCs w:val="false"/>
-                <w:color w:val="141413"/>
-                <w:sz w:val="17"/>
-                <w:szCs w:val="17"/>
-              </w:rPr>
-              <w:t xml:space="preserve">Four long-running sessions (scraper, model, UI, watcher) and 59 worker agents launched by the model session. Every reader, skeptic, synthesizer, ranker, writer, strategist and verifier was an Opus agent with a written brief. Later sessions ran on Claude Fable 5.1.</w:t>
-            </w:r>
-          </w:p>
-        </w:tc>
-      </w:tr>
-      <w:tr>
-        <w:trPr>
-          <w:cantSplit/>
-        </w:trPr>
-        <w:tc>
-          <w:tcPr>
-            <w:tcW w:type="dxa" w:w="3024"/>
-            <w:tcBorders>
-              <w:top w:val="single" w:color="D9D6CE" w:sz="4"/>
-              <w:left w:val="none" w:color="FFFFFF" w:sz="0"/>
-              <w:bottom w:val="single" w:color="D9D6CE" w:sz="4"/>
-              <w:right w:val="none" w:color="FFFFFF" w:sz="0"/>
-            </w:tcBorders>
-            <w:tcMar>
-              <w:top w:type="dxa" w:w="70"/>
-              <w:left w:type="dxa" w:w="90"/>
-              <w:bottom w:type="dxa" w:w="70"/>
-              <w:right w:type="dxa" w:w="90"/>
-            </w:tcMar>
-            <w:vAlign w:val="top"/>
-          </w:tcPr>
-          <w:p>
-            <w:pPr>
-              <w:spacing w:after="0" w:line="250"/>
-            </w:pPr>
-            <w:r>
-              <w:rPr>
-                <w:rFonts w:ascii="Arial" w:cs="Arial" w:eastAsia="Arial" w:hAnsi="Arial"/>
-                <w:b w:val="false"/>
-                <w:bCs w:val="false"/>
-                <w:color w:val="141413"/>
-                <w:sz w:val="17"/>
-                <w:szCs w:val="17"/>
-              </w:rPr>
-              <w:t xml:space="preserve">Git worktrees and a PR chain</w:t>
-            </w:r>
-          </w:p>
-        </w:tc>
-        <w:tc>
-          <w:tcPr>
-            <w:tcW w:type="dxa" w:w="6624"/>
-            <w:tcBorders>
-              <w:top w:val="single" w:color="D9D6CE" w:sz="4"/>
-              <w:left w:val="none" w:color="FFFFFF" w:sz="0"/>
-              <w:bottom w:val="single" w:color="D9D6CE" w:sz="4"/>
-              <w:right w:val="none" w:color="FFFFFF" w:sz="0"/>
-            </w:tcBorders>
-            <w:tcMar>
-              <w:top w:type="dxa" w:w="70"/>
-              <w:left w:type="dxa" w:w="90"/>
-              <w:bottom w:type="dxa" w:w="70"/>
-              <w:right w:type="dxa" w:w="90"/>
-            </w:tcMar>
-            <w:vAlign w:val="top"/>
-          </w:tcPr>
-          <w:p>
-            <w:pPr>
-              <w:spacing w:after="0" w:line="250"/>
-            </w:pPr>
-            <w:r>
-              <w:rPr>
-                <w:rFonts w:ascii="Arial" w:cs="Arial" w:eastAsia="Arial" w:hAnsi="Arial"/>
-                <w:b w:val="false"/>
-                <w:bCs w:val="false"/>
-                <w:color w:val="141413"/>
-                <w:sz w:val="17"/>
-                <w:szCs w:val="17"/>
-              </w:rPr>
-              <w:t xml:space="preserve">Each session owned one branch and one open pull request. No two agents edited the same file. Chain: scaffold #1, gap-data #2, corpus #5, Parker's needle branch, data-moat #16, quant-model #21, ui #22.</w:t>
-            </w:r>
-          </w:p>
-        </w:tc>
-      </w:tr>
-      <w:tr>
-        <w:trPr>
-          <w:cantSplit/>
-        </w:trPr>
-        <w:tc>
-          <w:tcPr>
-            <w:tcW w:type="dxa" w:w="3024"/>
-            <w:tcBorders>
-              <w:top w:val="single" w:color="D9D6CE" w:sz="4"/>
-              <w:left w:val="none" w:color="FFFFFF" w:sz="0"/>
-              <w:bottom w:val="single" w:color="D9D6CE" w:sz="4"/>
-              <w:right w:val="none" w:color="FFFFFF" w:sz="0"/>
-            </w:tcBorders>
-            <w:tcMar>
-              <w:top w:type="dxa" w:w="70"/>
-              <w:left w:type="dxa" w:w="90"/>
-              <w:bottom w:type="dxa" w:w="70"/>
-              <w:right w:type="dxa" w:w="90"/>
-            </w:tcMar>
-            <w:vAlign w:val="top"/>
-          </w:tcPr>
-          <w:p>
-            <w:pPr>
-              <w:spacing w:after="0" w:line="250"/>
-            </w:pPr>
-            <w:r>
-              <w:rPr>
-                <w:rFonts w:ascii="Arial" w:cs="Arial" w:eastAsia="Arial" w:hAnsi="Arial"/>
-                <w:b w:val="false"/>
-                <w:bCs w:val="false"/>
-                <w:color w:val="141413"/>
-                <w:sz w:val="17"/>
-                <w:szCs w:val="17"/>
-              </w:rPr>
-              <w:t xml:space="preserve">Python collectors</w:t>
-            </w:r>
-          </w:p>
-        </w:tc>
-        <w:tc>
-          <w:tcPr>
-            <w:tcW w:type="dxa" w:w="6624"/>
-            <w:tcBorders>
-              <w:top w:val="single" w:color="D9D6CE" w:sz="4"/>
-              <w:left w:val="none" w:color="FFFFFF" w:sz="0"/>
-              <w:bottom w:val="single" w:color="D9D6CE" w:sz="4"/>
-              <w:right w:val="none" w:color="FFFFFF" w:sz="0"/>
-            </w:tcBorders>
-            <w:tcMar>
-              <w:top w:type="dxa" w:w="70"/>
-              <w:left w:type="dxa" w:w="90"/>
-              <w:bottom w:type="dxa" w:w="70"/>
-              <w:right w:type="dxa" w:w="90"/>
-            </w:tcMar>
-            <w:vAlign w:val="top"/>
-          </w:tcPr>
-          <w:p>
-            <w:pPr>
-              <w:spacing w:after="0" w:line="250"/>
-            </w:pPr>
-            <w:r>
-              <w:rPr>
-                <w:rFonts w:ascii="Arial" w:cs="Arial" w:eastAsia="Arial" w:hAnsi="Arial"/>
-                <w:b w:val="false"/>
-                <w:bCs w:val="false"/>
-                <w:color w:val="141413"/>
-                <w:sz w:val="17"/>
-                <w:szCs w:val="17"/>
-              </w:rPr>
-              <w:t xml:space="preserve">Fetched SEC EDGAR filings and XBRL companyfacts, DailyMed labels, Orange and Purple Book dates, CMS Part B and Part D files, NADAC, FAERS, ClinicalTrials.gov, ICER reports and GDELT news volumes into page-marked text and verified CSV tables.</w:t>
-            </w:r>
-          </w:p>
-        </w:tc>
-      </w:tr>
-      <w:tr>
-        <w:trPr>
-          <w:cantSplit/>
-        </w:trPr>
-        <w:tc>
-          <w:tcPr>
-            <w:tcW w:type="dxa" w:w="3024"/>
-            <w:tcBorders>
-              <w:top w:val="single" w:color="D9D6CE" w:sz="4"/>
-              <w:left w:val="none" w:color="FFFFFF" w:sz="0"/>
-              <w:bottom w:val="single" w:color="D9D6CE" w:sz="4"/>
-              <w:right w:val="none" w:color="FFFFFF" w:sz="0"/>
-            </w:tcBorders>
-            <w:tcMar>
-              <w:top w:type="dxa" w:w="70"/>
-              <w:left w:type="dxa" w:w="90"/>
-              <w:bottom w:type="dxa" w:w="70"/>
-              <w:right w:type="dxa" w:w="90"/>
-            </w:tcMar>
-            <w:vAlign w:val="top"/>
-          </w:tcPr>
-          <w:p>
-            <w:pPr>
-              <w:spacing w:after="0" w:line="250"/>
-            </w:pPr>
-            <w:r>
-              <w:rPr>
-                <w:rFonts w:ascii="Arial" w:cs="Arial" w:eastAsia="Arial" w:hAnsi="Arial"/>
-                <w:b w:val="false"/>
-                <w:bCs w:val="false"/>
-                <w:color w:val="141413"/>
-                <w:sz w:val="17"/>
-                <w:szCs w:val="17"/>
-              </w:rPr>
-              <w:t xml:space="preserve">The citation index (SQLite, FTS5)</w:t>
-            </w:r>
-          </w:p>
-        </w:tc>
-        <w:tc>
-          <w:tcPr>
-            <w:tcW w:type="dxa" w:w="6624"/>
-            <w:tcBorders>
-              <w:top w:val="single" w:color="D9D6CE" w:sz="4"/>
-              <w:left w:val="none" w:color="FFFFFF" w:sz="0"/>
-              <w:bottom w:val="single" w:color="D9D6CE" w:sz="4"/>
-              <w:right w:val="none" w:color="FFFFFF" w:sz="0"/>
-            </w:tcBorders>
-            <w:tcMar>
-              <w:top w:type="dxa" w:w="70"/>
-              <w:left w:type="dxa" w:w="90"/>
-              <w:bottom w:type="dxa" w:w="70"/>
-              <w:right w:type="dxa" w:w="90"/>
-            </w:tcMar>
-            <w:vAlign w:val="top"/>
-          </w:tcPr>
-          <w:p>
-            <w:pPr>
-              <w:spacing w:after="0" w:line="250"/>
-            </w:pPr>
-            <w:r>
-              <w:rPr>
-                <w:rFonts w:ascii="Arial" w:cs="Arial" w:eastAsia="Arial" w:hAnsi="Arial"/>
-                <w:b w:val="false"/>
-                <w:bCs w:val="false"/>
-                <w:color w:val="141413"/>
-                <w:sz w:val="17"/>
-                <w:szCs w:val="17"/>
-              </w:rPr>
-              <w:t xml:space="preserve">7,003 documents, 78,392 pages, 15,463 speaker turns and 117,904 fact rows. A five-call API: search_pages, search_facts, get_page, cite, verify_quote. Transcripts graded A to D for quotability; Bloomberg pages flagged as licensed.</w:t>
-            </w:r>
-          </w:p>
-        </w:tc>
-      </w:tr>
-      <w:tr>
-        <w:trPr>
-          <w:cantSplit/>
-        </w:trPr>
-        <w:tc>
-          <w:tcPr>
-            <w:tcW w:type="dxa" w:w="3024"/>
-            <w:tcBorders>
-              <w:top w:val="single" w:color="D9D6CE" w:sz="4"/>
-              <w:left w:val="none" w:color="FFFFFF" w:sz="0"/>
-              <w:bottom w:val="single" w:color="D9D6CE" w:sz="4"/>
-              <w:right w:val="none" w:color="FFFFFF" w:sz="0"/>
-            </w:tcBorders>
-            <w:tcMar>
-              <w:top w:type="dxa" w:w="70"/>
-              <w:left w:type="dxa" w:w="90"/>
-              <w:bottom w:type="dxa" w:w="70"/>
-              <w:right w:type="dxa" w:w="90"/>
-            </w:tcMar>
-            <w:vAlign w:val="top"/>
-          </w:tcPr>
-          <w:p>
-            <w:pPr>
-              <w:spacing w:after="0" w:line="250"/>
-            </w:pPr>
-            <w:r>
-              <w:rPr>
-                <w:rFonts w:ascii="Arial" w:cs="Arial" w:eastAsia="Arial" w:hAnsi="Arial"/>
-                <w:b w:val="false"/>
-                <w:bCs w:val="false"/>
-                <w:color w:val="141413"/>
-                <w:sz w:val="17"/>
-                <w:szCs w:val="17"/>
-              </w:rPr>
-              <w:t xml:space="preserve">Eight case retrieval helpers</w:t>
-            </w:r>
-          </w:p>
-        </w:tc>
-        <w:tc>
-          <w:tcPr>
-            <w:tcW w:type="dxa" w:w="6624"/>
-            <w:tcBorders>
-              <w:top w:val="single" w:color="D9D6CE" w:sz="4"/>
-              <w:left w:val="none" w:color="FFFFFF" w:sz="0"/>
-              <w:bottom w:val="single" w:color="D9D6CE" w:sz="4"/>
-              <w:right w:val="none" w:color="FFFFFF" w:sz="0"/>
-            </w:tcBorders>
-            <w:tcMar>
-              <w:top w:type="dxa" w:w="70"/>
-              <w:left w:type="dxa" w:w="90"/>
-              <w:bottom w:type="dxa" w:w="70"/>
-              <w:right w:type="dxa" w:w="90"/>
-            </w:tcMar>
-            <w:vAlign w:val="top"/>
-          </w:tcPr>
-          <w:p>
-            <w:pPr>
-              <w:spacing w:after="0" w:line="250"/>
-            </w:pPr>
-            <w:r>
-              <w:rPr>
-                <w:rFonts w:ascii="Arial" w:cs="Arial" w:eastAsia="Arial" w:hAnsi="Arial"/>
-                <w:b w:val="false"/>
-                <w:bCs w:val="false"/>
-                <w:color w:val="141413"/>
-                <w:sz w:val="17"/>
-                <w:szCs w:val="17"/>
-              </w:rPr>
-              <w:t xml:space="preserve">One per item on the case's own 'where findings hide' list: language drift, gross-to-net, working capital, segment changes, footnotes, call Q&amp;A, label fine print, peer forces. Each returns cited rows and never ranks them.</w:t>
-            </w:r>
-          </w:p>
-        </w:tc>
-      </w:tr>
-      <w:tr>
-        <w:trPr>
-          <w:cantSplit/>
-        </w:trPr>
-        <w:tc>
-          <w:tcPr>
-            <w:tcW w:type="dxa" w:w="3024"/>
-            <w:tcBorders>
-              <w:top w:val="single" w:color="D9D6CE" w:sz="4"/>
-              <w:left w:val="none" w:color="FFFFFF" w:sz="0"/>
-              <w:bottom w:val="single" w:color="D9D6CE" w:sz="4"/>
-              <w:right w:val="none" w:color="FFFFFF" w:sz="0"/>
-            </w:tcBorders>
-            <w:tcMar>
-              <w:top w:type="dxa" w:w="70"/>
-              <w:left w:type="dxa" w:w="90"/>
-              <w:bottom w:type="dxa" w:w="70"/>
-              <w:right w:type="dxa" w:w="90"/>
-            </w:tcMar>
-            <w:vAlign w:val="top"/>
-          </w:tcPr>
-          <w:p>
-            <w:pPr>
-              <w:spacing w:after="0" w:line="250"/>
-            </w:pPr>
-            <w:r>
-              <w:rPr>
-                <w:rFonts w:ascii="Arial" w:cs="Arial" w:eastAsia="Arial" w:hAnsi="Arial"/>
-                <w:b w:val="false"/>
-                <w:bCs w:val="false"/>
-                <w:color w:val="141413"/>
-                <w:sz w:val="17"/>
-                <w:szCs w:val="17"/>
-              </w:rPr>
-              <w:t xml:space="preserve">The per-number citation gate</w:t>
-            </w:r>
-          </w:p>
-        </w:tc>
-        <w:tc>
-          <w:tcPr>
-            <w:tcW w:type="dxa" w:w="6624"/>
-            <w:tcBorders>
-              <w:top w:val="single" w:color="D9D6CE" w:sz="4"/>
-              <w:left w:val="none" w:color="FFFFFF" w:sz="0"/>
-              <w:bottom w:val="single" w:color="D9D6CE" w:sz="4"/>
-              <w:right w:val="none" w:color="FFFFFF" w:sz="0"/>
-            </w:tcBorders>
-            <w:tcMar>
-              <w:top w:type="dxa" w:w="70"/>
-              <w:left w:type="dxa" w:w="90"/>
-              <w:bottom w:type="dxa" w:w="70"/>
-              <w:right w:type="dxa" w:w="90"/>
-            </w:tcMar>
-            <w:vAlign w:val="top"/>
-          </w:tcPr>
-          <w:p>
-            <w:pPr>
-              <w:spacing w:after="0" w:line="250"/>
-            </w:pPr>
-            <w:r>
-              <w:rPr>
-                <w:rFonts w:ascii="Arial" w:cs="Arial" w:eastAsia="Arial" w:hAnsi="Arial"/>
-                <w:b w:val="false"/>
-                <w:bCs w:val="false"/>
-                <w:color w:val="141413"/>
-                <w:sz w:val="17"/>
-                <w:szCs w:val="17"/>
-              </w:rPr>
-              <w:t xml:space="preserve">Python that checks every figure in every block one at a time against the quoted span, a recomputed derivation or a printed assumption label, and withholds anything else.</w:t>
-            </w:r>
-          </w:p>
-        </w:tc>
-      </w:tr>
-      <w:tr>
-        <w:trPr>
-          <w:cantSplit/>
-        </w:trPr>
-        <w:tc>
-          <w:tcPr>
-            <w:tcW w:type="dxa" w:w="3024"/>
-            <w:tcBorders>
-              <w:top w:val="single" w:color="D9D6CE" w:sz="4"/>
-              <w:left w:val="none" w:color="FFFFFF" w:sz="0"/>
-              <w:bottom w:val="single" w:color="D9D6CE" w:sz="4"/>
-              <w:right w:val="none" w:color="FFFFFF" w:sz="0"/>
-            </w:tcBorders>
-            <w:tcMar>
-              <w:top w:type="dxa" w:w="70"/>
-              <w:left w:type="dxa" w:w="90"/>
-              <w:bottom w:type="dxa" w:w="70"/>
-              <w:right w:type="dxa" w:w="90"/>
-            </w:tcMar>
-            <w:vAlign w:val="top"/>
-          </w:tcPr>
-          <w:p>
-            <w:pPr>
-              <w:spacing w:after="0" w:line="250"/>
-            </w:pPr>
-            <w:r>
-              <w:rPr>
-                <w:rFonts w:ascii="Arial" w:cs="Arial" w:eastAsia="Arial" w:hAnsi="Arial"/>
-                <w:b w:val="false"/>
-                <w:bCs w:val="false"/>
-                <w:color w:val="141413"/>
-                <w:sz w:val="17"/>
-                <w:szCs w:val="17"/>
-              </w:rPr>
-              <w:t xml:space="preserve">Adversarial review pattern</w:t>
-            </w:r>
-          </w:p>
-        </w:tc>
-        <w:tc>
-          <w:tcPr>
-            <w:tcW w:type="dxa" w:w="6624"/>
-            <w:tcBorders>
-              <w:top w:val="single" w:color="D9D6CE" w:sz="4"/>
-              <w:left w:val="none" w:color="FFFFFF" w:sz="0"/>
-              <w:bottom w:val="single" w:color="D9D6CE" w:sz="4"/>
-              <w:right w:val="none" w:color="FFFFFF" w:sz="0"/>
-            </w:tcBorders>
-            <w:tcMar>
-              <w:top w:type="dxa" w:w="70"/>
-              <w:left w:type="dxa" w:w="90"/>
-              <w:bottom w:type="dxa" w:w="70"/>
-              <w:right w:type="dxa" w:w="90"/>
-            </w:tcMar>
-            <w:vAlign w:val="top"/>
-          </w:tcPr>
-          <w:p>
-            <w:pPr>
-              <w:spacing w:after="0" w:line="250"/>
-            </w:pPr>
-            <w:r>
-              <w:rPr>
-                <w:rFonts w:ascii="Arial" w:cs="Arial" w:eastAsia="Arial" w:hAnsi="Arial"/>
-                <w:b w:val="false"/>
-                <w:bCs w:val="false"/>
-                <w:color w:val="141413"/>
-                <w:sz w:val="17"/>
-                <w:szCs w:val="17"/>
-              </w:rPr>
-              <w:t xml:space="preserve">Two skeptic agents with different lenses, two rounds in which each reads the other, a synthesizer who never averages, then a fresh verifier. Used on the quant spec, the gate itself, the backtest, every Part 1 finding and every Part 2 move.</w:t>
-            </w:r>
-          </w:p>
-        </w:tc>
-      </w:tr>
-      <w:tr>
-        <w:trPr>
-          <w:cantSplit/>
-        </w:trPr>
-        <w:tc>
-          <w:tcPr>
-            <w:tcW w:type="dxa" w:w="3024"/>
-            <w:tcBorders>
-              <w:top w:val="single" w:color="D9D6CE" w:sz="4"/>
-              <w:left w:val="none" w:color="FFFFFF" w:sz="0"/>
-              <w:bottom w:val="single" w:color="D9D6CE" w:sz="4"/>
-              <w:right w:val="none" w:color="FFFFFF" w:sz="0"/>
-            </w:tcBorders>
-            <w:tcMar>
-              <w:top w:type="dxa" w:w="70"/>
-              <w:left w:type="dxa" w:w="90"/>
-              <w:bottom w:type="dxa" w:w="70"/>
-              <w:right w:type="dxa" w:w="90"/>
-            </w:tcMar>
-            <w:vAlign w:val="top"/>
-          </w:tcPr>
-          <w:p>
-            <w:pPr>
-              <w:spacing w:after="0" w:line="250"/>
-            </w:pPr>
-            <w:r>
-              <w:rPr>
-                <w:rFonts w:ascii="Arial" w:cs="Arial" w:eastAsia="Arial" w:hAnsi="Arial"/>
-                <w:b w:val="false"/>
-                <w:bCs w:val="false"/>
-                <w:color w:val="141413"/>
-                <w:sz w:val="17"/>
-                <w:szCs w:val="17"/>
-              </w:rPr>
-              <w:t xml:space="preserve">Bloomberg transcripts and WRDS I/B/E/S</w:t>
-            </w:r>
-          </w:p>
-        </w:tc>
-        <w:tc>
-          <w:tcPr>
-            <w:tcW w:type="dxa" w:w="6624"/>
-            <w:tcBorders>
-              <w:top w:val="single" w:color="D9D6CE" w:sz="4"/>
-              <w:left w:val="none" w:color="FFFFFF" w:sz="0"/>
-              <w:bottom w:val="single" w:color="D9D6CE" w:sz="4"/>
-              <w:right w:val="none" w:color="FFFFFF" w:sz="0"/>
-            </w:tcBorders>
-            <w:tcMar>
-              <w:top w:type="dxa" w:w="70"/>
-              <w:left w:type="dxa" w:w="90"/>
-              <w:bottom w:type="dxa" w:w="70"/>
-              <w:right w:type="dxa" w:w="90"/>
-            </w:tcMar>
-            <w:vAlign w:val="top"/>
-          </w:tcPr>
-          <w:p>
-            <w:pPr>
-              <w:spacing w:after="0" w:line="250"/>
-            </w:pPr>
-            <w:r>
-              <w:rPr>
-                <w:rFonts w:ascii="Arial" w:cs="Arial" w:eastAsia="Arial" w:hAnsi="Arial"/>
-                <w:b w:val="false"/>
-                <w:bCs w:val="false"/>
-                <w:color w:val="141413"/>
-                <w:sz w:val="17"/>
-                <w:szCs w:val="17"/>
-              </w:rPr>
-              <w:t xml:space="preserve">Official transcripts to upgrade quote grades, and analyst consensus for the 'was it priced in' test. Both are licensed, so we used them locally and cited them by label only.</w:t>
-            </w:r>
-          </w:p>
-        </w:tc>
-      </w:tr>
-      <w:tr>
-        <w:trPr>
-          <w:cantSplit/>
-        </w:trPr>
-        <w:tc>
-          <w:tcPr>
-            <w:tcW w:type="dxa" w:w="3024"/>
-            <w:tcBorders>
-              <w:top w:val="single" w:color="D9D6CE" w:sz="4"/>
-              <w:left w:val="none" w:color="FFFFFF" w:sz="0"/>
-              <w:bottom w:val="single" w:color="D9D6CE" w:sz="4"/>
-              <w:right w:val="none" w:color="FFFFFF" w:sz="0"/>
-            </w:tcBorders>
-            <w:tcMar>
-              <w:top w:type="dxa" w:w="70"/>
-              <w:left w:type="dxa" w:w="90"/>
-              <w:bottom w:type="dxa" w:w="70"/>
-              <w:right w:type="dxa" w:w="90"/>
-            </w:tcMar>
-            <w:vAlign w:val="top"/>
-          </w:tcPr>
-          <w:p>
-            <w:pPr>
-              <w:spacing w:after="0" w:line="250"/>
-            </w:pPr>
-            <w:r>
-              <w:rPr>
-                <w:rFonts w:ascii="Arial" w:cs="Arial" w:eastAsia="Arial" w:hAnsi="Arial"/>
-                <w:b w:val="false"/>
-                <w:bCs w:val="false"/>
-                <w:color w:val="141413"/>
-                <w:sz w:val="17"/>
-                <w:szCs w:val="17"/>
-              </w:rPr>
-              <w:t xml:space="preserve">pytest</w:t>
-            </w:r>
-          </w:p>
-        </w:tc>
-        <w:tc>
-          <w:tcPr>
-            <w:tcW w:type="dxa" w:w="6624"/>
-            <w:tcBorders>
-              <w:top w:val="single" w:color="D9D6CE" w:sz="4"/>
-              <w:left w:val="none" w:color="FFFFFF" w:sz="0"/>
-              <w:bottom w:val="single" w:color="D9D6CE" w:sz="4"/>
-              <w:right w:val="none" w:color="FFFFFF" w:sz="0"/>
-            </w:tcBorders>
-            <w:tcMar>
-              <w:top w:type="dxa" w:w="70"/>
-              <w:left w:type="dxa" w:w="90"/>
-              <w:bottom w:type="dxa" w:w="70"/>
-              <w:right w:type="dxa" w:w="90"/>
-            </w:tcMar>
-            <w:vAlign w:val="top"/>
-          </w:tcPr>
-          <w:p>
-            <w:pPr>
-              <w:spacing w:after="0" w:line="250"/>
-            </w:pPr>
-            <w:r>
-              <w:rPr>
-                <w:rFonts w:ascii="Arial" w:cs="Arial" w:eastAsia="Arial" w:hAnsi="Arial"/>
-                <w:b w:val="false"/>
-                <w:bCs w:val="false"/>
-                <w:color w:val="141413"/>
-                <w:sz w:val="17"/>
-                <w:szCs w:val="17"/>
-              </w:rPr>
-              <w:t xml:space="preserve">259 tests across the data, citation and model code. Every behavior change carried a test.</w:t>
-            </w:r>
-          </w:p>
-        </w:tc>
-      </w:tr>
-      <w:tr>
-        <w:trPr>
-          <w:cantSplit/>
-        </w:trPr>
-        <w:tc>
-          <w:tcPr>
-            <w:tcW w:type="dxa" w:w="3024"/>
-            <w:tcBorders>
-              <w:top w:val="single" w:color="D9D6CE" w:sz="4"/>
-              <w:left w:val="none" w:color="FFFFFF" w:sz="0"/>
-              <w:bottom w:val="single" w:color="D9D6CE" w:sz="4"/>
-              <w:right w:val="none" w:color="FFFFFF" w:sz="0"/>
-            </w:tcBorders>
-            <w:tcMar>
-              <w:top w:type="dxa" w:w="70"/>
-              <w:left w:type="dxa" w:w="90"/>
-              <w:bottom w:type="dxa" w:w="70"/>
-              <w:right w:type="dxa" w:w="90"/>
-            </w:tcMar>
-            <w:vAlign w:val="top"/>
-          </w:tcPr>
-          <w:p>
-            <w:pPr>
-              <w:spacing w:after="0" w:line="250"/>
-            </w:pPr>
-            <w:r>
-              <w:rPr>
-                <w:rFonts w:ascii="Arial" w:cs="Arial" w:eastAsia="Arial" w:hAnsi="Arial"/>
-                <w:b w:val="false"/>
-                <w:bCs w:val="false"/>
-                <w:color w:val="141413"/>
-                <w:sz w:val="17"/>
-                <w:szCs w:val="17"/>
-              </w:rPr>
-              <w:t xml:space="preserve">Vite and React, published as a claude.ai Artifact</w:t>
-            </w:r>
-          </w:p>
-        </w:tc>
-        <w:tc>
-          <w:tcPr>
-            <w:tcW w:type="dxa" w:w="6624"/>
-            <w:tcBorders>
-              <w:top w:val="single" w:color="D9D6CE" w:sz="4"/>
-              <w:left w:val="none" w:color="FFFFFF" w:sz="0"/>
-              <w:bottom w:val="single" w:color="D9D6CE" w:sz="4"/>
-              <w:right w:val="none" w:color="FFFFFF" w:sz="0"/>
-            </w:tcBorders>
-            <w:tcMar>
-              <w:top w:type="dxa" w:w="70"/>
-              <w:left w:type="dxa" w:w="90"/>
-              <w:bottom w:type="dxa" w:w="70"/>
-              <w:right w:type="dxa" w:w="90"/>
-            </w:tcMar>
-            <w:vAlign w:val="top"/>
-          </w:tcPr>
-          <w:p>
-            <w:pPr>
-              <w:spacing w:after="0" w:line="250"/>
-            </w:pPr>
-            <w:r>
-              <w:rPr>
-                <w:rFonts w:ascii="Arial" w:cs="Arial" w:eastAsia="Arial" w:hAnsi="Arial"/>
-                <w:b w:val="false"/>
-                <w:bCs w:val="false"/>
-                <w:color w:val="141413"/>
-                <w:sz w:val="17"/>
-                <w:szCs w:val="17"/>
-              </w:rPr>
-              <w:t xml:space="preserve">A static one-page chat with cached answers and no API key, republished on every commit so Parker and the judges always saw the committed state.</w:t>
-            </w:r>
-          </w:p>
-        </w:tc>
-      </w:tr>
-      <w:tr>
-        <w:trPr>
-          <w:cantSplit/>
-        </w:trPr>
-        <w:tc>
-          <w:tcPr>
-            <w:tcW w:type="dxa" w:w="3024"/>
-            <w:tcBorders>
-              <w:top w:val="single" w:color="D9D6CE" w:sz="4"/>
-              <w:left w:val="none" w:color="FFFFFF" w:sz="0"/>
-              <w:bottom w:val="single" w:color="D9D6CE" w:sz="4"/>
-              <w:right w:val="none" w:color="FFFFFF" w:sz="0"/>
-            </w:tcBorders>
-            <w:tcMar>
-              <w:top w:type="dxa" w:w="70"/>
-              <w:left w:type="dxa" w:w="90"/>
-              <w:bottom w:type="dxa" w:w="70"/>
-              <w:right w:type="dxa" w:w="90"/>
-            </w:tcMar>
-            <w:vAlign w:val="top"/>
-          </w:tcPr>
-          <w:p>
-            <w:pPr>
-              <w:spacing w:after="0" w:line="250"/>
-            </w:pPr>
-            <w:r>
-              <w:rPr>
-                <w:rFonts w:ascii="Arial" w:cs="Arial" w:eastAsia="Arial" w:hAnsi="Arial"/>
-                <w:b w:val="false"/>
-                <w:bCs w:val="false"/>
-                <w:color w:val="141413"/>
-                <w:sz w:val="17"/>
-                <w:szCs w:val="17"/>
-              </w:rPr>
-              <w:t xml:space="preserve">agent-chat (GitHub issues)</w:t>
-            </w:r>
-          </w:p>
-        </w:tc>
-        <w:tc>
-          <w:tcPr>
-            <w:tcW w:type="dxa" w:w="6624"/>
-            <w:tcBorders>
-              <w:top w:val="single" w:color="D9D6CE" w:sz="4"/>
-              <w:left w:val="none" w:color="FFFFFF" w:sz="0"/>
-              <w:bottom w:val="single" w:color="D9D6CE" w:sz="4"/>
-              <w:right w:val="none" w:color="FFFFFF" w:sz="0"/>
-            </w:tcBorders>
-            <w:tcMar>
-              <w:top w:type="dxa" w:w="70"/>
-              <w:left w:type="dxa" w:w="90"/>
-              <w:bottom w:type="dxa" w:w="70"/>
-              <w:right w:type="dxa" w:w="90"/>
-            </w:tcMar>
-            <w:vAlign w:val="top"/>
-          </w:tcPr>
-          <w:p>
-            <w:pPr>
-              <w:spacing w:after="0" w:line="250"/>
-            </w:pPr>
-            <w:r>
-              <w:rPr>
-                <w:rFonts w:ascii="Arial" w:cs="Arial" w:eastAsia="Arial" w:hAnsi="Arial"/>
-                <w:b w:val="false"/>
-                <w:bCs w:val="false"/>
-                <w:color w:val="141413"/>
-                <w:sz w:val="17"/>
-                <w:szCs w:val="17"/>
-              </w:rPr>
-              <w:t xml:space="preserve">A message bus so Aidan's and Parker's agents could ask each other for data without a human relaying.</w:t>
-            </w:r>
-          </w:p>
-        </w:tc>
-      </w:tr>
-      <w:tr>
-        <w:trPr>
-          <w:cantSplit/>
-        </w:trPr>
-        <w:tc>
-          <w:tcPr>
-            <w:tcW w:type="dxa" w:w="3024"/>
-            <w:tcBorders>
-              <w:top w:val="single" w:color="D9D6CE" w:sz="4"/>
-              <w:left w:val="none" w:color="FFFFFF" w:sz="0"/>
-              <w:bottom w:val="single" w:color="D9D6CE" w:sz="4"/>
-              <w:right w:val="none" w:color="FFFFFF" w:sz="0"/>
-            </w:tcBorders>
-            <w:tcMar>
-              <w:top w:type="dxa" w:w="70"/>
-              <w:left w:type="dxa" w:w="90"/>
-              <w:bottom w:type="dxa" w:w="70"/>
-              <w:right w:type="dxa" w:w="90"/>
-            </w:tcMar>
-            <w:vAlign w:val="top"/>
-          </w:tcPr>
-          <w:p>
-            <w:pPr>
-              <w:spacing w:after="0" w:line="250"/>
-            </w:pPr>
-            <w:r>
-              <w:rPr>
-                <w:rFonts w:ascii="Arial" w:cs="Arial" w:eastAsia="Arial" w:hAnsi="Arial"/>
-                <w:b w:val="false"/>
-                <w:bCs w:val="false"/>
-                <w:color w:val="141413"/>
-                <w:sz w:val="17"/>
-                <w:szCs w:val="17"/>
-              </w:rPr>
-              <w:t xml:space="preserve">Cloudflare R2</w:t>
-            </w:r>
-          </w:p>
-        </w:tc>
-        <w:tc>
-          <w:tcPr>
-            <w:tcW w:type="dxa" w:w="6624"/>
-            <w:tcBorders>
-              <w:top w:val="single" w:color="D9D6CE" w:sz="4"/>
-              <w:left w:val="none" w:color="FFFFFF" w:sz="0"/>
-              <w:bottom w:val="single" w:color="D9D6CE" w:sz="4"/>
-              <w:right w:val="none" w:color="FFFFFF" w:sz="0"/>
-            </w:tcBorders>
-            <w:tcMar>
-              <w:top w:type="dxa" w:w="70"/>
-              <w:left w:type="dxa" w:w="90"/>
-              <w:bottom w:type="dxa" w:w="70"/>
-              <w:right w:type="dxa" w:w="90"/>
-            </w:tcMar>
-            <w:vAlign w:val="top"/>
-          </w:tcPr>
-          <w:p>
-            <w:pPr>
-              <w:spacing w:after="0" w:line="250"/>
-            </w:pPr>
-            <w:r>
-              <w:rPr>
-                <w:rFonts w:ascii="Arial" w:cs="Arial" w:eastAsia="Arial" w:hAnsi="Arial"/>
-                <w:b w:val="false"/>
-                <w:bCs w:val="false"/>
-                <w:color w:val="141413"/>
-                <w:sz w:val="17"/>
-                <w:szCs w:val="17"/>
-              </w:rPr>
-              <w:t xml:space="preserve">Bulk storage for the corpus and the gzipped index, so either machine could rebuild from the same bytes.</w:t>
-            </w:r>
-          </w:p>
-        </w:tc>
-      </w:tr>
-    </w:tbl>
-    <w:p>
-      <w:pPr>
-        <w:pStyle w:val="Heading1"/>
-        <w:spacing w:before="520" w:after="200"/>
-      </w:pPr>
-      <w:r>
-        <w:rPr>
-          <w:rFonts w:ascii="Georgia" w:cs="Georgia" w:eastAsia="Georgia" w:hAnsi="Georgia"/>
-          <w:color w:val="141413"/>
-          <w:sz w:val="38"/>
-          <w:szCs w:val="38"/>
-        </w:rPr>
-        <w:t xml:space="preserve">3. The workflow</w:t>
-      </w:r>
-    </w:p>
-    <w:p>
-      <w:pPr>
-        <w:pStyle w:val="Heading2"/>
-        <w:keepNext/>
-        <w:spacing w:before="320" w:after="120"/>
-      </w:pPr>
-      <w:r>
-        <w:rPr>
-          <w:rFonts w:ascii="Georgia" w:cs="Georgia" w:eastAsia="Georgia" w:hAnsi="Georgia"/>
-          <w:color w:val="141413"/>
-          <w:sz w:val="27"/>
-          <w:szCs w:val="27"/>
-        </w:rPr>
-        <w:t xml:space="preserve">3.1 How documents got into the AI</w:t>
+        <w:t xml:space="preserve">The Fine Print asks for two things. Part 1: pick one of ten drugmakers and find at least five findings that would change an investor's view and are not obvious, each with impact math, a peer comparison and a confidence call, plus the single sharpest one and a side-by-side of one product against the rivals the case names. Part 2: take the CEO's seat and recommend one move for the next 24 months with a budget or a commitment of people, the math, the two strongest rejected alternatives, and measurable kill signals in months six to twelve.</w:t>
       </w:r>
     </w:p>
     <w:p>
@@ -1580,7 +424,45 @@
           <w:sz w:val="21"/>
           <w:szCs w:val="21"/>
         </w:rPr>
-        <w:t xml:space="preserve">We did not paste any document into a prompt. Collectors fetched each filing, transcript, label and dataset by code and wrote page-marked text, with a marker of the form [[page N | printed P]] on every page so that a file page and a printed page could both be cited. The index stores pages, speaker turns and fact rows with full-text search, and every row carries a locator of the form doc_id#p&lt;page&gt; that opens the source.</w:t>
+        <w:t xml:space="preserve">The case also names the two ways AI fails at this. On Part 1, a model will surface things management has already said plainly, such as the patent cliff, the press-release headline and the starter thread. On Part 2, as the case puts it, AI will argue convincingly for almost any strategy. We treated both as design constraints.</w:t>
+      </w:r>
+    </w:p>
+    <w:p>
+      <w:pPr>
+        <w:pBdr>
+          <w:left w:val="single" w:color="D97757" w:sz="18" w:space="12"/>
+        </w:pBdr>
+        <w:spacing w:after="60" w:before="60" w:line="320"/>
+        <w:ind w:left="360" w:right="720"/>
+      </w:pPr>
+      <w:r>
+        <w:rPr>
+          <w:rFonts w:ascii="Georgia" w:cs="Georgia" w:eastAsia="Georgia" w:hAnsi="Georgia"/>
+          <w:i/>
+          <w:iCs/>
+          <w:color w:val="141413"/>
+          <w:sz w:val="25"/>
+          <w:szCs w:val="25"/>
+        </w:rPr>
+        <w:t xml:space="preserve">Every number you see was computed by deterministic code from a cited page. AI writes the words, argues the case and reads the calls, and nothing it says reaches the screen until a verifier has found it on the page it cites. When the AI was wrong, and it was, that is how we caught it.</w:t>
+      </w:r>
+    </w:p>
+    <w:p>
+      <w:pPr>
+        <w:pBdr>
+          <w:left w:val="single" w:color="D97757" w:sz="18" w:space="12"/>
+        </w:pBdr>
+        <w:spacing w:after="200"/>
+        <w:ind w:left="360" w:right="720"/>
+      </w:pPr>
+      <w:r>
+        <w:rPr>
+          <w:rFonts w:ascii="Arial" w:cs="Arial" w:eastAsia="Arial" w:hAnsi="Arial"/>
+          <w:color w:val="5E5D59"/>
+          <w:sz w:val="17"/>
+          <w:szCs w:val="17"/>
+        </w:rPr>
+        <w:t xml:space="preserve">The line we built the system around</w:t>
       </w:r>
     </w:p>
     <w:p>
@@ -1594,21 +476,21 @@
           <w:sz w:val="21"/>
           <w:szCs w:val="21"/>
         </w:rPr>
-        <w:t xml:space="preserve">Two rules made the index trustworthy enough to reason over. The first is verify_quote. A sentence passes only if it is an exact substring of the one page it cites, after quotes, dashes, whitespace and case are normalised. The retrieval helpers drop any row that fails before an agent sees it. The second is grading and flagging. Transcripts are graded A to D and only A and B may be quoted. Bloomberg pages are cited by label and never copied. A mislabeled transcript and a set of fool.com files that open with model-written summaries are marked superseded or unquotable.</w:t>
+        <w:t xml:space="preserve">We worked to three rules. First, code fetches and verifies. Scripts collect every source into a page-marked index, nothing is pasted into a chat, and every quote is checked by exact match on its page. Second, agents reason blind and against each other. The readers who look for findings cannot see any prior run, and every candidate must survive two skeptics who read each other's arguments. Third, people decide. A person opened the cited page behind every needle before it reached a slide, and the company pick rests on that read.</w:t>
       </w:r>
     </w:p>
     <w:p>
       <w:pPr>
         <w:keepNext/>
-        <w:spacing w:before="140" w:after="80"/>
+        <w:spacing w:after="80" w:before="140"/>
         <w:jc w:val="center"/>
       </w:pPr>
       <w:r>
         <w:drawing>
           <wp:inline distT="0" distB="0" distL="0" distR="0">
-            <wp:extent cx="6124575" cy="1323975"/>
+            <wp:extent cx="6124575" cy="1857375"/>
             <wp:effectExtent t="0" r="0" b="0" l="0"/>
-            <wp:docPr id="1" name="" descr="" title=""/>
+            <wp:docPr id="2" name="" descr="" title=""/>
             <wp:cNvGraphicFramePr>
               <a:graphicFrameLocks xmlns:a="http://schemas.openxmlformats.org/drawingml/2006/main" noChangeAspect="1"/>
             </wp:cNvGraphicFramePr>
@@ -1631,7 +513,7 @@
                   <pic:spPr bwMode="auto">
                     <a:xfrm>
                       <a:off x="0" y="0"/>
-                      <a:ext cx="6124575" cy="1323975"/>
+                      <a:ext cx="6124575" cy="1857375"/>
                     </a:xfrm>
                     <a:prstGeom prst="rect">
                       <a:avLst/>
@@ -1656,7 +538,22 @@
           <w:sz w:val="17"/>
           <w:szCs w:val="17"/>
         </w:rPr>
-        <w:t xml:space="preserve">Figure 3. A document's path into the index. The collectors also keep a log of their own confident mistakes, which became the largest part of our AI-was-wrong record.</w:t>
+        <w:t xml:space="preserve">Figure 2. The system at a glance. Sources flow left to right. People and a watcher session sit alongside the two stages where judgment happens.</w:t>
+      </w:r>
+    </w:p>
+    <w:p>
+      <w:pPr>
+        <w:pStyle w:val="Heading1"/>
+        <w:spacing w:after="200" w:before="520"/>
+      </w:pPr>
+      <w:r>
+        <w:rPr>
+          <w:rFonts w:ascii="Georgia" w:cs="Georgia" w:eastAsia="Georgia" w:hAnsi="Georgia"/>
+          <w:color w:val="141413"/>
+          <w:sz w:val="38"/>
+          <w:szCs w:val="38"/>
+        </w:rPr>
+        <w:t xml:space="preserve">2. The tools and what each was for</w:t>
       </w:r>
     </w:p>
     <w:p>
@@ -1670,14 +567,1070 @@
           <w:sz w:val="21"/>
           <w:szCs w:val="21"/>
         </w:rPr>
-        <w:t xml:space="preserve">The scraper session ran five waves on Saturday. The first fetched the ten shortlist companies at filing depth, with ten quarters of graded calls. The second built the Part 2 backend for all ten companies and 52 drugs, covering epidemiology, peers, deals, pipeline, costs and prescribers. The third filled every gap a free source could still fill. The fourth built the eight case helpers. The fifth was a Part 2 evidence wave of labels, head-to-head trials, payer tables, deal comps and 325 page-anchored filing numbers for the three picked companies. Explicit negatives are rows too, so 'no public source' is itself citable.</w:t>
+        <w:t xml:space="preserve">We used one model family for every reasoning step and ordinary engineering for everything else. No model wrote a number into the deliverable. Models proposed findings, argued over them and verified them. Code decided what could be shown.</w:t>
+      </w:r>
+    </w:p>
+    <w:tbl>
+      <w:tblPr>
+        <w:tblW w:type="dxa" w:w="9648"/>
+        <w:tblBorders>
+          <w:top w:val="single" w:color="auto" w:sz="4"/>
+          <w:left w:val="single" w:color="auto" w:sz="4"/>
+          <w:bottom w:val="single" w:color="auto" w:sz="4"/>
+          <w:right w:val="single" w:color="auto" w:sz="4"/>
+          <w:insideH w:val="single" w:color="auto" w:sz="4"/>
+          <w:insideV w:val="single" w:color="auto" w:sz="4"/>
+        </w:tblBorders>
+      </w:tblPr>
+      <w:tblGrid>
+        <w:gridCol w:w="3024"/>
+        <w:gridCol w:w="6624"/>
+      </w:tblGrid>
+      <w:tr>
+        <w:trPr>
+          <w:tblHeader/>
+        </w:trPr>
+        <w:tc>
+          <w:tcPr>
+            <w:tcW w:type="dxa" w:w="3024"/>
+            <w:tcBorders>
+              <w:top w:val="single" w:color="D9D6CE" w:sz="4"/>
+              <w:left w:val="none" w:color="FFFFFF" w:sz="0"/>
+              <w:bottom w:val="single" w:color="D9D6CE" w:sz="4"/>
+              <w:right w:val="none" w:color="FFFFFF" w:sz="0"/>
+            </w:tcBorders>
+            <w:shd w:fill="F0EEE6" w:color="auto" w:val="clear"/>
+            <w:tcMar>
+              <w:top w:type="dxa" w:w="70"/>
+              <w:left w:type="dxa" w:w="90"/>
+              <w:bottom w:type="dxa" w:w="70"/>
+              <w:right w:type="dxa" w:w="90"/>
+            </w:tcMar>
+            <w:vAlign w:val="top"/>
+          </w:tcPr>
+          <w:p>
+            <w:pPr>
+              <w:spacing w:after="0" w:line="250"/>
+            </w:pPr>
+            <w:r>
+              <w:rPr>
+                <w:rFonts w:ascii="Arial" w:cs="Arial" w:eastAsia="Arial" w:hAnsi="Arial"/>
+                <w:b/>
+                <w:bCs/>
+                <w:color w:val="141413"/>
+                <w:sz w:val="17"/>
+                <w:szCs w:val="17"/>
+              </w:rPr>
+              <w:t xml:space="preserve">Tool</w:t>
+            </w:r>
+          </w:p>
+        </w:tc>
+        <w:tc>
+          <w:tcPr>
+            <w:tcW w:type="dxa" w:w="6624"/>
+            <w:tcBorders>
+              <w:top w:val="single" w:color="D9D6CE" w:sz="4"/>
+              <w:left w:val="none" w:color="FFFFFF" w:sz="0"/>
+              <w:bottom w:val="single" w:color="D9D6CE" w:sz="4"/>
+              <w:right w:val="none" w:color="FFFFFF" w:sz="0"/>
+            </w:tcBorders>
+            <w:shd w:fill="F0EEE6" w:color="auto" w:val="clear"/>
+            <w:tcMar>
+              <w:top w:type="dxa" w:w="70"/>
+              <w:left w:type="dxa" w:w="90"/>
+              <w:bottom w:type="dxa" w:w="70"/>
+              <w:right w:type="dxa" w:w="90"/>
+            </w:tcMar>
+            <w:vAlign w:val="top"/>
+          </w:tcPr>
+          <w:p>
+            <w:pPr>
+              <w:spacing w:after="0" w:line="250"/>
+            </w:pPr>
+            <w:r>
+              <w:rPr>
+                <w:rFonts w:ascii="Arial" w:cs="Arial" w:eastAsia="Arial" w:hAnsi="Arial"/>
+                <w:b/>
+                <w:bCs/>
+                <w:color w:val="141413"/>
+                <w:sz w:val="17"/>
+                <w:szCs w:val="17"/>
+              </w:rPr>
+              <w:t xml:space="preserve">What it was for</w:t>
+            </w:r>
+          </w:p>
+        </w:tc>
+      </w:tr>
+      <w:tr>
+        <w:trPr>
+          <w:cantSplit/>
+        </w:trPr>
+        <w:tc>
+          <w:tcPr>
+            <w:tcW w:type="dxa" w:w="3024"/>
+            <w:tcBorders>
+              <w:top w:val="single" w:color="D9D6CE" w:sz="4"/>
+              <w:left w:val="none" w:color="FFFFFF" w:sz="0"/>
+              <w:bottom w:val="single" w:color="D9D6CE" w:sz="4"/>
+              <w:right w:val="none" w:color="FFFFFF" w:sz="0"/>
+            </w:tcBorders>
+            <w:tcMar>
+              <w:top w:type="dxa" w:w="70"/>
+              <w:left w:type="dxa" w:w="90"/>
+              <w:bottom w:type="dxa" w:w="70"/>
+              <w:right w:type="dxa" w:w="90"/>
+            </w:tcMar>
+            <w:vAlign w:val="top"/>
+          </w:tcPr>
+          <w:p>
+            <w:pPr>
+              <w:spacing w:after="0" w:line="250"/>
+            </w:pPr>
+            <w:r>
+              <w:rPr>
+                <w:rFonts w:ascii="Arial" w:cs="Arial" w:eastAsia="Arial" w:hAnsi="Arial"/>
+                <w:b w:val="false"/>
+                <w:bCs w:val="false"/>
+                <w:color w:val="141413"/>
+                <w:sz w:val="17"/>
+                <w:szCs w:val="17"/>
+              </w:rPr>
+              <w:t xml:space="preserve">Claude Code with Claude Opus 5.5</w:t>
+            </w:r>
+          </w:p>
+        </w:tc>
+        <w:tc>
+          <w:tcPr>
+            <w:tcW w:type="dxa" w:w="6624"/>
+            <w:tcBorders>
+              <w:top w:val="single" w:color="D9D6CE" w:sz="4"/>
+              <w:left w:val="none" w:color="FFFFFF" w:sz="0"/>
+              <w:bottom w:val="single" w:color="D9D6CE" w:sz="4"/>
+              <w:right w:val="none" w:color="FFFFFF" w:sz="0"/>
+            </w:tcBorders>
+            <w:tcMar>
+              <w:top w:type="dxa" w:w="70"/>
+              <w:left w:type="dxa" w:w="90"/>
+              <w:bottom w:type="dxa" w:w="70"/>
+              <w:right w:type="dxa" w:w="90"/>
+            </w:tcMar>
+            <w:vAlign w:val="top"/>
+          </w:tcPr>
+          <w:p>
+            <w:pPr>
+              <w:spacing w:after="0" w:line="250"/>
+            </w:pPr>
+            <w:r>
+              <w:rPr>
+                <w:rFonts w:ascii="Arial" w:cs="Arial" w:eastAsia="Arial" w:hAnsi="Arial"/>
+                <w:b w:val="false"/>
+                <w:bCs w:val="false"/>
+                <w:color w:val="141413"/>
+                <w:sz w:val="17"/>
+                <w:szCs w:val="17"/>
+              </w:rPr>
+              <w:t xml:space="preserve">Four long-running sessions (scraper, model, UI, watcher) and 59 worker agents launched by the model session. Every reader, skeptic, synthesizer, ranker, writer, strategist and verifier was an Opus agent with a written brief. Later sessions ran on Claude Fable 5.1.</w:t>
+            </w:r>
+          </w:p>
+        </w:tc>
+      </w:tr>
+      <w:tr>
+        <w:trPr>
+          <w:cantSplit/>
+        </w:trPr>
+        <w:tc>
+          <w:tcPr>
+            <w:tcW w:type="dxa" w:w="3024"/>
+            <w:tcBorders>
+              <w:top w:val="single" w:color="D9D6CE" w:sz="4"/>
+              <w:left w:val="none" w:color="FFFFFF" w:sz="0"/>
+              <w:bottom w:val="single" w:color="D9D6CE" w:sz="4"/>
+              <w:right w:val="none" w:color="FFFFFF" w:sz="0"/>
+            </w:tcBorders>
+            <w:tcMar>
+              <w:top w:type="dxa" w:w="70"/>
+              <w:left w:type="dxa" w:w="90"/>
+              <w:bottom w:type="dxa" w:w="70"/>
+              <w:right w:type="dxa" w:w="90"/>
+            </w:tcMar>
+            <w:vAlign w:val="top"/>
+          </w:tcPr>
+          <w:p>
+            <w:pPr>
+              <w:spacing w:after="0" w:line="250"/>
+            </w:pPr>
+            <w:r>
+              <w:rPr>
+                <w:rFonts w:ascii="Arial" w:cs="Arial" w:eastAsia="Arial" w:hAnsi="Arial"/>
+                <w:b w:val="false"/>
+                <w:bCs w:val="false"/>
+                <w:color w:val="141413"/>
+                <w:sz w:val="17"/>
+                <w:szCs w:val="17"/>
+              </w:rPr>
+              <w:t xml:space="preserve">Git worktrees and a PR chain</w:t>
+            </w:r>
+          </w:p>
+        </w:tc>
+        <w:tc>
+          <w:tcPr>
+            <w:tcW w:type="dxa" w:w="6624"/>
+            <w:tcBorders>
+              <w:top w:val="single" w:color="D9D6CE" w:sz="4"/>
+              <w:left w:val="none" w:color="FFFFFF" w:sz="0"/>
+              <w:bottom w:val="single" w:color="D9D6CE" w:sz="4"/>
+              <w:right w:val="none" w:color="FFFFFF" w:sz="0"/>
+            </w:tcBorders>
+            <w:tcMar>
+              <w:top w:type="dxa" w:w="70"/>
+              <w:left w:type="dxa" w:w="90"/>
+              <w:bottom w:type="dxa" w:w="70"/>
+              <w:right w:type="dxa" w:w="90"/>
+            </w:tcMar>
+            <w:vAlign w:val="top"/>
+          </w:tcPr>
+          <w:p>
+            <w:pPr>
+              <w:spacing w:after="0" w:line="250"/>
+            </w:pPr>
+            <w:r>
+              <w:rPr>
+                <w:rFonts w:ascii="Arial" w:cs="Arial" w:eastAsia="Arial" w:hAnsi="Arial"/>
+                <w:b w:val="false"/>
+                <w:bCs w:val="false"/>
+                <w:color w:val="141413"/>
+                <w:sz w:val="17"/>
+                <w:szCs w:val="17"/>
+              </w:rPr>
+              <w:t xml:space="preserve">Each session owned one branch and one open pull request. No two agents edited the same file. Chain: scaffold #1, gap-data #2, corpus #5, Parker's needle branch, data-moat #16, quant-model #21, ui #22.</w:t>
+            </w:r>
+          </w:p>
+        </w:tc>
+      </w:tr>
+      <w:tr>
+        <w:trPr>
+          <w:cantSplit/>
+        </w:trPr>
+        <w:tc>
+          <w:tcPr>
+            <w:tcW w:type="dxa" w:w="3024"/>
+            <w:tcBorders>
+              <w:top w:val="single" w:color="D9D6CE" w:sz="4"/>
+              <w:left w:val="none" w:color="FFFFFF" w:sz="0"/>
+              <w:bottom w:val="single" w:color="D9D6CE" w:sz="4"/>
+              <w:right w:val="none" w:color="FFFFFF" w:sz="0"/>
+            </w:tcBorders>
+            <w:tcMar>
+              <w:top w:type="dxa" w:w="70"/>
+              <w:left w:type="dxa" w:w="90"/>
+              <w:bottom w:type="dxa" w:w="70"/>
+              <w:right w:type="dxa" w:w="90"/>
+            </w:tcMar>
+            <w:vAlign w:val="top"/>
+          </w:tcPr>
+          <w:p>
+            <w:pPr>
+              <w:spacing w:after="0" w:line="250"/>
+            </w:pPr>
+            <w:r>
+              <w:rPr>
+                <w:rFonts w:ascii="Arial" w:cs="Arial" w:eastAsia="Arial" w:hAnsi="Arial"/>
+                <w:b w:val="false"/>
+                <w:bCs w:val="false"/>
+                <w:color w:val="141413"/>
+                <w:sz w:val="17"/>
+                <w:szCs w:val="17"/>
+              </w:rPr>
+              <w:t xml:space="preserve">Python collectors</w:t>
+            </w:r>
+          </w:p>
+        </w:tc>
+        <w:tc>
+          <w:tcPr>
+            <w:tcW w:type="dxa" w:w="6624"/>
+            <w:tcBorders>
+              <w:top w:val="single" w:color="D9D6CE" w:sz="4"/>
+              <w:left w:val="none" w:color="FFFFFF" w:sz="0"/>
+              <w:bottom w:val="single" w:color="D9D6CE" w:sz="4"/>
+              <w:right w:val="none" w:color="FFFFFF" w:sz="0"/>
+            </w:tcBorders>
+            <w:tcMar>
+              <w:top w:type="dxa" w:w="70"/>
+              <w:left w:type="dxa" w:w="90"/>
+              <w:bottom w:type="dxa" w:w="70"/>
+              <w:right w:type="dxa" w:w="90"/>
+            </w:tcMar>
+            <w:vAlign w:val="top"/>
+          </w:tcPr>
+          <w:p>
+            <w:pPr>
+              <w:spacing w:after="0" w:line="250"/>
+            </w:pPr>
+            <w:r>
+              <w:rPr>
+                <w:rFonts w:ascii="Arial" w:cs="Arial" w:eastAsia="Arial" w:hAnsi="Arial"/>
+                <w:b w:val="false"/>
+                <w:bCs w:val="false"/>
+                <w:color w:val="141413"/>
+                <w:sz w:val="17"/>
+                <w:szCs w:val="17"/>
+              </w:rPr>
+              <w:t xml:space="preserve">Fetched SEC EDGAR filings and XBRL companyfacts, DailyMed labels, Orange and Purple Book dates, CMS Part B and Part D files, NADAC, FAERS, ClinicalTrials.gov, ICER reports and GDELT news volumes into page-marked text and verified CSV tables.</w:t>
+            </w:r>
+          </w:p>
+        </w:tc>
+      </w:tr>
+      <w:tr>
+        <w:trPr>
+          <w:cantSplit/>
+        </w:trPr>
+        <w:tc>
+          <w:tcPr>
+            <w:tcW w:type="dxa" w:w="3024"/>
+            <w:tcBorders>
+              <w:top w:val="single" w:color="D9D6CE" w:sz="4"/>
+              <w:left w:val="none" w:color="FFFFFF" w:sz="0"/>
+              <w:bottom w:val="single" w:color="D9D6CE" w:sz="4"/>
+              <w:right w:val="none" w:color="FFFFFF" w:sz="0"/>
+            </w:tcBorders>
+            <w:tcMar>
+              <w:top w:type="dxa" w:w="70"/>
+              <w:left w:type="dxa" w:w="90"/>
+              <w:bottom w:type="dxa" w:w="70"/>
+              <w:right w:type="dxa" w:w="90"/>
+            </w:tcMar>
+            <w:vAlign w:val="top"/>
+          </w:tcPr>
+          <w:p>
+            <w:pPr>
+              <w:spacing w:after="0" w:line="250"/>
+            </w:pPr>
+            <w:r>
+              <w:rPr>
+                <w:rFonts w:ascii="Arial" w:cs="Arial" w:eastAsia="Arial" w:hAnsi="Arial"/>
+                <w:b w:val="false"/>
+                <w:bCs w:val="false"/>
+                <w:color w:val="141413"/>
+                <w:sz w:val="17"/>
+                <w:szCs w:val="17"/>
+              </w:rPr>
+              <w:t xml:space="preserve">The citation index (SQLite, FTS5)</w:t>
+            </w:r>
+          </w:p>
+        </w:tc>
+        <w:tc>
+          <w:tcPr>
+            <w:tcW w:type="dxa" w:w="6624"/>
+            <w:tcBorders>
+              <w:top w:val="single" w:color="D9D6CE" w:sz="4"/>
+              <w:left w:val="none" w:color="FFFFFF" w:sz="0"/>
+              <w:bottom w:val="single" w:color="D9D6CE" w:sz="4"/>
+              <w:right w:val="none" w:color="FFFFFF" w:sz="0"/>
+            </w:tcBorders>
+            <w:tcMar>
+              <w:top w:type="dxa" w:w="70"/>
+              <w:left w:type="dxa" w:w="90"/>
+              <w:bottom w:type="dxa" w:w="70"/>
+              <w:right w:type="dxa" w:w="90"/>
+            </w:tcMar>
+            <w:vAlign w:val="top"/>
+          </w:tcPr>
+          <w:p>
+            <w:pPr>
+              <w:spacing w:after="0" w:line="250"/>
+            </w:pPr>
+            <w:r>
+              <w:rPr>
+                <w:rFonts w:ascii="Arial" w:cs="Arial" w:eastAsia="Arial" w:hAnsi="Arial"/>
+                <w:b w:val="false"/>
+                <w:bCs w:val="false"/>
+                <w:color w:val="141413"/>
+                <w:sz w:val="17"/>
+                <w:szCs w:val="17"/>
+              </w:rPr>
+              <w:t xml:space="preserve">7,005 documents, 78,392 pages, 15,463 speaker turns and 118,329 fact rows. A five-call API: search_pages, search_facts, get_page, cite, verify_quote. Transcripts graded A to D for quotability; Bloomberg pages flagged as licensed.</w:t>
+            </w:r>
+          </w:p>
+        </w:tc>
+      </w:tr>
+      <w:tr>
+        <w:trPr>
+          <w:cantSplit/>
+        </w:trPr>
+        <w:tc>
+          <w:tcPr>
+            <w:tcW w:type="dxa" w:w="3024"/>
+            <w:tcBorders>
+              <w:top w:val="single" w:color="D9D6CE" w:sz="4"/>
+              <w:left w:val="none" w:color="FFFFFF" w:sz="0"/>
+              <w:bottom w:val="single" w:color="D9D6CE" w:sz="4"/>
+              <w:right w:val="none" w:color="FFFFFF" w:sz="0"/>
+            </w:tcBorders>
+            <w:tcMar>
+              <w:top w:type="dxa" w:w="70"/>
+              <w:left w:type="dxa" w:w="90"/>
+              <w:bottom w:type="dxa" w:w="70"/>
+              <w:right w:type="dxa" w:w="90"/>
+            </w:tcMar>
+            <w:vAlign w:val="top"/>
+          </w:tcPr>
+          <w:p>
+            <w:pPr>
+              <w:spacing w:after="0" w:line="250"/>
+            </w:pPr>
+            <w:r>
+              <w:rPr>
+                <w:rFonts w:ascii="Arial" w:cs="Arial" w:eastAsia="Arial" w:hAnsi="Arial"/>
+                <w:b w:val="false"/>
+                <w:bCs w:val="false"/>
+                <w:color w:val="141413"/>
+                <w:sz w:val="17"/>
+                <w:szCs w:val="17"/>
+              </w:rPr>
+              <w:t xml:space="preserve">Eight case retrieval helpers</w:t>
+            </w:r>
+          </w:p>
+        </w:tc>
+        <w:tc>
+          <w:tcPr>
+            <w:tcW w:type="dxa" w:w="6624"/>
+            <w:tcBorders>
+              <w:top w:val="single" w:color="D9D6CE" w:sz="4"/>
+              <w:left w:val="none" w:color="FFFFFF" w:sz="0"/>
+              <w:bottom w:val="single" w:color="D9D6CE" w:sz="4"/>
+              <w:right w:val="none" w:color="FFFFFF" w:sz="0"/>
+            </w:tcBorders>
+            <w:tcMar>
+              <w:top w:type="dxa" w:w="70"/>
+              <w:left w:type="dxa" w:w="90"/>
+              <w:bottom w:type="dxa" w:w="70"/>
+              <w:right w:type="dxa" w:w="90"/>
+            </w:tcMar>
+            <w:vAlign w:val="top"/>
+          </w:tcPr>
+          <w:p>
+            <w:pPr>
+              <w:spacing w:after="0" w:line="250"/>
+            </w:pPr>
+            <w:r>
+              <w:rPr>
+                <w:rFonts w:ascii="Arial" w:cs="Arial" w:eastAsia="Arial" w:hAnsi="Arial"/>
+                <w:b w:val="false"/>
+                <w:bCs w:val="false"/>
+                <w:color w:val="141413"/>
+                <w:sz w:val="17"/>
+                <w:szCs w:val="17"/>
+              </w:rPr>
+              <w:t xml:space="preserve">One per item on the case's own 'where findings hide' list: language drift, gross-to-net, working capital, segment changes, footnotes, call Q&amp;A, label fine print, peer forces. Each returns cited rows and never ranks them.</w:t>
+            </w:r>
+          </w:p>
+        </w:tc>
+      </w:tr>
+      <w:tr>
+        <w:trPr>
+          <w:cantSplit/>
+        </w:trPr>
+        <w:tc>
+          <w:tcPr>
+            <w:tcW w:type="dxa" w:w="3024"/>
+            <w:tcBorders>
+              <w:top w:val="single" w:color="D9D6CE" w:sz="4"/>
+              <w:left w:val="none" w:color="FFFFFF" w:sz="0"/>
+              <w:bottom w:val="single" w:color="D9D6CE" w:sz="4"/>
+              <w:right w:val="none" w:color="FFFFFF" w:sz="0"/>
+            </w:tcBorders>
+            <w:tcMar>
+              <w:top w:type="dxa" w:w="70"/>
+              <w:left w:type="dxa" w:w="90"/>
+              <w:bottom w:type="dxa" w:w="70"/>
+              <w:right w:type="dxa" w:w="90"/>
+            </w:tcMar>
+            <w:vAlign w:val="top"/>
+          </w:tcPr>
+          <w:p>
+            <w:pPr>
+              <w:spacing w:after="0" w:line="250"/>
+            </w:pPr>
+            <w:r>
+              <w:rPr>
+                <w:rFonts w:ascii="Arial" w:cs="Arial" w:eastAsia="Arial" w:hAnsi="Arial"/>
+                <w:b w:val="false"/>
+                <w:bCs w:val="false"/>
+                <w:color w:val="141413"/>
+                <w:sz w:val="17"/>
+                <w:szCs w:val="17"/>
+              </w:rPr>
+              <w:t xml:space="preserve">The per-number citation gate</w:t>
+            </w:r>
+          </w:p>
+        </w:tc>
+        <w:tc>
+          <w:tcPr>
+            <w:tcW w:type="dxa" w:w="6624"/>
+            <w:tcBorders>
+              <w:top w:val="single" w:color="D9D6CE" w:sz="4"/>
+              <w:left w:val="none" w:color="FFFFFF" w:sz="0"/>
+              <w:bottom w:val="single" w:color="D9D6CE" w:sz="4"/>
+              <w:right w:val="none" w:color="FFFFFF" w:sz="0"/>
+            </w:tcBorders>
+            <w:tcMar>
+              <w:top w:type="dxa" w:w="70"/>
+              <w:left w:type="dxa" w:w="90"/>
+              <w:bottom w:type="dxa" w:w="70"/>
+              <w:right w:type="dxa" w:w="90"/>
+            </w:tcMar>
+            <w:vAlign w:val="top"/>
+          </w:tcPr>
+          <w:p>
+            <w:pPr>
+              <w:spacing w:after="0" w:line="250"/>
+            </w:pPr>
+            <w:r>
+              <w:rPr>
+                <w:rFonts w:ascii="Arial" w:cs="Arial" w:eastAsia="Arial" w:hAnsi="Arial"/>
+                <w:b w:val="false"/>
+                <w:bCs w:val="false"/>
+                <w:color w:val="141413"/>
+                <w:sz w:val="17"/>
+                <w:szCs w:val="17"/>
+              </w:rPr>
+              <w:t xml:space="preserve">Python that checks every figure in every block one at a time against the quoted span, a recomputed derivation or a printed assumption label, and withholds anything else.</w:t>
+            </w:r>
+          </w:p>
+        </w:tc>
+      </w:tr>
+      <w:tr>
+        <w:trPr>
+          <w:cantSplit/>
+        </w:trPr>
+        <w:tc>
+          <w:tcPr>
+            <w:tcW w:type="dxa" w:w="3024"/>
+            <w:tcBorders>
+              <w:top w:val="single" w:color="D9D6CE" w:sz="4"/>
+              <w:left w:val="none" w:color="FFFFFF" w:sz="0"/>
+              <w:bottom w:val="single" w:color="D9D6CE" w:sz="4"/>
+              <w:right w:val="none" w:color="FFFFFF" w:sz="0"/>
+            </w:tcBorders>
+            <w:tcMar>
+              <w:top w:type="dxa" w:w="70"/>
+              <w:left w:type="dxa" w:w="90"/>
+              <w:bottom w:type="dxa" w:w="70"/>
+              <w:right w:type="dxa" w:w="90"/>
+            </w:tcMar>
+            <w:vAlign w:val="top"/>
+          </w:tcPr>
+          <w:p>
+            <w:pPr>
+              <w:spacing w:after="0" w:line="250"/>
+            </w:pPr>
+            <w:r>
+              <w:rPr>
+                <w:rFonts w:ascii="Arial" w:cs="Arial" w:eastAsia="Arial" w:hAnsi="Arial"/>
+                <w:b w:val="false"/>
+                <w:bCs w:val="false"/>
+                <w:color w:val="141413"/>
+                <w:sz w:val="17"/>
+                <w:szCs w:val="17"/>
+              </w:rPr>
+              <w:t xml:space="preserve">Adversarial review pattern</w:t>
+            </w:r>
+          </w:p>
+        </w:tc>
+        <w:tc>
+          <w:tcPr>
+            <w:tcW w:type="dxa" w:w="6624"/>
+            <w:tcBorders>
+              <w:top w:val="single" w:color="D9D6CE" w:sz="4"/>
+              <w:left w:val="none" w:color="FFFFFF" w:sz="0"/>
+              <w:bottom w:val="single" w:color="D9D6CE" w:sz="4"/>
+              <w:right w:val="none" w:color="FFFFFF" w:sz="0"/>
+            </w:tcBorders>
+            <w:tcMar>
+              <w:top w:type="dxa" w:w="70"/>
+              <w:left w:type="dxa" w:w="90"/>
+              <w:bottom w:type="dxa" w:w="70"/>
+              <w:right w:type="dxa" w:w="90"/>
+            </w:tcMar>
+            <w:vAlign w:val="top"/>
+          </w:tcPr>
+          <w:p>
+            <w:pPr>
+              <w:spacing w:after="0" w:line="250"/>
+            </w:pPr>
+            <w:r>
+              <w:rPr>
+                <w:rFonts w:ascii="Arial" w:cs="Arial" w:eastAsia="Arial" w:hAnsi="Arial"/>
+                <w:b w:val="false"/>
+                <w:bCs w:val="false"/>
+                <w:color w:val="141413"/>
+                <w:sz w:val="17"/>
+                <w:szCs w:val="17"/>
+              </w:rPr>
+              <w:t xml:space="preserve">Two skeptic agents with different lenses, two rounds in which each reads the other, a synthesizer who never averages, then a fresh verifier. Used on the quant spec, the gate itself, the backtest, every Part 1 finding and every Part 2 move, and later on the pitch deck's layout and wording.</w:t>
+            </w:r>
+          </w:p>
+        </w:tc>
+      </w:tr>
+      <w:tr>
+        <w:trPr>
+          <w:cantSplit/>
+        </w:trPr>
+        <w:tc>
+          <w:tcPr>
+            <w:tcW w:type="dxa" w:w="3024"/>
+            <w:tcBorders>
+              <w:top w:val="single" w:color="D9D6CE" w:sz="4"/>
+              <w:left w:val="none" w:color="FFFFFF" w:sz="0"/>
+              <w:bottom w:val="single" w:color="D9D6CE" w:sz="4"/>
+              <w:right w:val="none" w:color="FFFFFF" w:sz="0"/>
+            </w:tcBorders>
+            <w:tcMar>
+              <w:top w:type="dxa" w:w="70"/>
+              <w:left w:type="dxa" w:w="90"/>
+              <w:bottom w:type="dxa" w:w="70"/>
+              <w:right w:type="dxa" w:w="90"/>
+            </w:tcMar>
+            <w:vAlign w:val="top"/>
+          </w:tcPr>
+          <w:p>
+            <w:pPr>
+              <w:spacing w:after="0" w:line="250"/>
+            </w:pPr>
+            <w:r>
+              <w:rPr>
+                <w:rFonts w:ascii="Arial" w:cs="Arial" w:eastAsia="Arial" w:hAnsi="Arial"/>
+                <w:b w:val="false"/>
+                <w:bCs w:val="false"/>
+                <w:color w:val="141413"/>
+                <w:sz w:val="17"/>
+                <w:szCs w:val="17"/>
+              </w:rPr>
+              <w:t xml:space="preserve">Bloomberg transcripts and WRDS I/B/E/S</w:t>
+            </w:r>
+          </w:p>
+        </w:tc>
+        <w:tc>
+          <w:tcPr>
+            <w:tcW w:type="dxa" w:w="6624"/>
+            <w:tcBorders>
+              <w:top w:val="single" w:color="D9D6CE" w:sz="4"/>
+              <w:left w:val="none" w:color="FFFFFF" w:sz="0"/>
+              <w:bottom w:val="single" w:color="D9D6CE" w:sz="4"/>
+              <w:right w:val="none" w:color="FFFFFF" w:sz="0"/>
+            </w:tcBorders>
+            <w:tcMar>
+              <w:top w:type="dxa" w:w="70"/>
+              <w:left w:type="dxa" w:w="90"/>
+              <w:bottom w:type="dxa" w:w="70"/>
+              <w:right w:type="dxa" w:w="90"/>
+            </w:tcMar>
+            <w:vAlign w:val="top"/>
+          </w:tcPr>
+          <w:p>
+            <w:pPr>
+              <w:spacing w:after="0" w:line="250"/>
+            </w:pPr>
+            <w:r>
+              <w:rPr>
+                <w:rFonts w:ascii="Arial" w:cs="Arial" w:eastAsia="Arial" w:hAnsi="Arial"/>
+                <w:b w:val="false"/>
+                <w:bCs w:val="false"/>
+                <w:color w:val="141413"/>
+                <w:sz w:val="17"/>
+                <w:szCs w:val="17"/>
+              </w:rPr>
+              <w:t xml:space="preserve">Official transcripts to upgrade quote grades, and analyst consensus for the 'was it priced in' test. Both are licensed, so we used them locally and cited them by label only.</w:t>
+            </w:r>
+          </w:p>
+        </w:tc>
+      </w:tr>
+      <w:tr>
+        <w:trPr>
+          <w:cantSplit/>
+        </w:trPr>
+        <w:tc>
+          <w:tcPr>
+            <w:tcW w:type="dxa" w:w="3024"/>
+            <w:tcBorders>
+              <w:top w:val="single" w:color="D9D6CE" w:sz="4"/>
+              <w:left w:val="none" w:color="FFFFFF" w:sz="0"/>
+              <w:bottom w:val="single" w:color="D9D6CE" w:sz="4"/>
+              <w:right w:val="none" w:color="FFFFFF" w:sz="0"/>
+            </w:tcBorders>
+            <w:tcMar>
+              <w:top w:type="dxa" w:w="70"/>
+              <w:left w:type="dxa" w:w="90"/>
+              <w:bottom w:type="dxa" w:w="70"/>
+              <w:right w:type="dxa" w:w="90"/>
+            </w:tcMar>
+            <w:vAlign w:val="top"/>
+          </w:tcPr>
+          <w:p>
+            <w:pPr>
+              <w:spacing w:after="0" w:line="250"/>
+            </w:pPr>
+            <w:r>
+              <w:rPr>
+                <w:rFonts w:ascii="Arial" w:cs="Arial" w:eastAsia="Arial" w:hAnsi="Arial"/>
+                <w:b w:val="false"/>
+                <w:bCs w:val="false"/>
+                <w:color w:val="141413"/>
+                <w:sz w:val="17"/>
+                <w:szCs w:val="17"/>
+              </w:rPr>
+              <w:t xml:space="preserve">pytest</w:t>
+            </w:r>
+          </w:p>
+        </w:tc>
+        <w:tc>
+          <w:tcPr>
+            <w:tcW w:type="dxa" w:w="6624"/>
+            <w:tcBorders>
+              <w:top w:val="single" w:color="D9D6CE" w:sz="4"/>
+              <w:left w:val="none" w:color="FFFFFF" w:sz="0"/>
+              <w:bottom w:val="single" w:color="D9D6CE" w:sz="4"/>
+              <w:right w:val="none" w:color="FFFFFF" w:sz="0"/>
+            </w:tcBorders>
+            <w:tcMar>
+              <w:top w:type="dxa" w:w="70"/>
+              <w:left w:type="dxa" w:w="90"/>
+              <w:bottom w:type="dxa" w:w="70"/>
+              <w:right w:type="dxa" w:w="90"/>
+            </w:tcMar>
+            <w:vAlign w:val="top"/>
+          </w:tcPr>
+          <w:p>
+            <w:pPr>
+              <w:spacing w:after="0" w:line="250"/>
+            </w:pPr>
+            <w:r>
+              <w:rPr>
+                <w:rFonts w:ascii="Arial" w:cs="Arial" w:eastAsia="Arial" w:hAnsi="Arial"/>
+                <w:b w:val="false"/>
+                <w:bCs w:val="false"/>
+                <w:color w:val="141413"/>
+                <w:sz w:val="17"/>
+                <w:szCs w:val="17"/>
+              </w:rPr>
+              <w:t xml:space="preserve">259 tests across the data, citation and model code. Every behavior change carried a test.</w:t>
+            </w:r>
+          </w:p>
+        </w:tc>
+      </w:tr>
+      <w:tr>
+        <w:trPr>
+          <w:cantSplit/>
+        </w:trPr>
+        <w:tc>
+          <w:tcPr>
+            <w:tcW w:type="dxa" w:w="3024"/>
+            <w:tcBorders>
+              <w:top w:val="single" w:color="D9D6CE" w:sz="4"/>
+              <w:left w:val="none" w:color="FFFFFF" w:sz="0"/>
+              <w:bottom w:val="single" w:color="D9D6CE" w:sz="4"/>
+              <w:right w:val="none" w:color="FFFFFF" w:sz="0"/>
+            </w:tcBorders>
+            <w:tcMar>
+              <w:top w:type="dxa" w:w="70"/>
+              <w:left w:type="dxa" w:w="90"/>
+              <w:bottom w:type="dxa" w:w="70"/>
+              <w:right w:type="dxa" w:w="90"/>
+            </w:tcMar>
+            <w:vAlign w:val="top"/>
+          </w:tcPr>
+          <w:p>
+            <w:pPr>
+              <w:spacing w:after="0" w:line="250"/>
+            </w:pPr>
+            <w:r>
+              <w:rPr>
+                <w:rFonts w:ascii="Arial" w:cs="Arial" w:eastAsia="Arial" w:hAnsi="Arial"/>
+                <w:b w:val="false"/>
+                <w:bCs w:val="false"/>
+                <w:color w:val="141413"/>
+                <w:sz w:val="17"/>
+                <w:szCs w:val="17"/>
+              </w:rPr>
+              <w:t xml:space="preserve">Vite and React, published as a claude.ai Artifact and on GitHub Pages</w:t>
+            </w:r>
+          </w:p>
+        </w:tc>
+        <w:tc>
+          <w:tcPr>
+            <w:tcW w:type="dxa" w:w="6624"/>
+            <w:tcBorders>
+              <w:top w:val="single" w:color="D9D6CE" w:sz="4"/>
+              <w:left w:val="none" w:color="FFFFFF" w:sz="0"/>
+              <w:bottom w:val="single" w:color="D9D6CE" w:sz="4"/>
+              <w:right w:val="none" w:color="FFFFFF" w:sz="0"/>
+            </w:tcBorders>
+            <w:tcMar>
+              <w:top w:type="dxa" w:w="70"/>
+              <w:left w:type="dxa" w:w="90"/>
+              <w:bottom w:type="dxa" w:w="70"/>
+              <w:right w:type="dxa" w:w="90"/>
+            </w:tcMar>
+            <w:vAlign w:val="top"/>
+          </w:tcPr>
+          <w:p>
+            <w:pPr>
+              <w:spacing w:after="0" w:line="250"/>
+            </w:pPr>
+            <w:r>
+              <w:rPr>
+                <w:rFonts w:ascii="Arial" w:cs="Arial" w:eastAsia="Arial" w:hAnsi="Arial"/>
+                <w:b w:val="false"/>
+                <w:bCs w:val="false"/>
+                <w:color w:val="141413"/>
+                <w:sz w:val="17"/>
+                <w:szCs w:val="17"/>
+              </w:rPr>
+              <w:t xml:space="preserve">A static one-page chat with cached answers and no API key, republished to the artifact on every commit so Parker always saw the committed state. The artifact needs a claude.ai login, so a public copy on GitHub Pages is what the deck's QR code opens.</w:t>
+            </w:r>
+          </w:p>
+        </w:tc>
+      </w:tr>
+      <w:tr>
+        <w:trPr>
+          <w:cantSplit/>
+        </w:trPr>
+        <w:tc>
+          <w:tcPr>
+            <w:tcW w:type="dxa" w:w="3024"/>
+            <w:tcBorders>
+              <w:top w:val="single" w:color="D9D6CE" w:sz="4"/>
+              <w:left w:val="none" w:color="FFFFFF" w:sz="0"/>
+              <w:bottom w:val="single" w:color="D9D6CE" w:sz="4"/>
+              <w:right w:val="none" w:color="FFFFFF" w:sz="0"/>
+            </w:tcBorders>
+            <w:tcMar>
+              <w:top w:type="dxa" w:w="70"/>
+              <w:left w:type="dxa" w:w="90"/>
+              <w:bottom w:type="dxa" w:w="70"/>
+              <w:right w:type="dxa" w:w="90"/>
+            </w:tcMar>
+            <w:vAlign w:val="top"/>
+          </w:tcPr>
+          <w:p>
+            <w:pPr>
+              <w:spacing w:after="0" w:line="250"/>
+            </w:pPr>
+            <w:r>
+              <w:rPr>
+                <w:rFonts w:ascii="Arial" w:cs="Arial" w:eastAsia="Arial" w:hAnsi="Arial"/>
+                <w:b w:val="false"/>
+                <w:bCs w:val="false"/>
+                <w:color w:val="141413"/>
+                <w:sz w:val="17"/>
+                <w:szCs w:val="17"/>
+              </w:rPr>
+              <w:t xml:space="preserve">python-pptx and PowerPoint</w:t>
+            </w:r>
+          </w:p>
+        </w:tc>
+        <w:tc>
+          <w:tcPr>
+            <w:tcW w:type="dxa" w:w="6624"/>
+            <w:tcBorders>
+              <w:top w:val="single" w:color="D9D6CE" w:sz="4"/>
+              <w:left w:val="none" w:color="FFFFFF" w:sz="0"/>
+              <w:bottom w:val="single" w:color="D9D6CE" w:sz="4"/>
+              <w:right w:val="none" w:color="FFFFFF" w:sz="0"/>
+            </w:tcBorders>
+            <w:tcMar>
+              <w:top w:type="dxa" w:w="70"/>
+              <w:left w:type="dxa" w:w="90"/>
+              <w:bottom w:type="dxa" w:w="70"/>
+              <w:right w:type="dxa" w:w="90"/>
+            </w:tcMar>
+            <w:vAlign w:val="top"/>
+          </w:tcPr>
+          <w:p>
+            <w:pPr>
+              <w:spacing w:after="0" w:line="250"/>
+            </w:pPr>
+            <w:r>
+              <w:rPr>
+                <w:rFonts w:ascii="Arial" w:cs="Arial" w:eastAsia="Arial" w:hAnsi="Arial"/>
+                <w:b w:val="false"/>
+                <w:bCs w:val="false"/>
+                <w:color w:val="141413"/>
+                <w:sz w:val="17"/>
+                <w:szCs w:val="17"/>
+              </w:rPr>
+              <w:t xml:space="preserve">Built the seven-slide pitch deck from code in the product's theme, with every number on a slide linked to its filing page. Review renders were exported through PowerPoint itself, because LibreOffice swapped in other fonts and misreported the layout.</w:t>
+            </w:r>
+          </w:p>
+        </w:tc>
+      </w:tr>
+      <w:tr>
+        <w:trPr>
+          <w:cantSplit/>
+        </w:trPr>
+        <w:tc>
+          <w:tcPr>
+            <w:tcW w:type="dxa" w:w="3024"/>
+            <w:tcBorders>
+              <w:top w:val="single" w:color="D9D6CE" w:sz="4"/>
+              <w:left w:val="none" w:color="FFFFFF" w:sz="0"/>
+              <w:bottom w:val="single" w:color="D9D6CE" w:sz="4"/>
+              <w:right w:val="none" w:color="FFFFFF" w:sz="0"/>
+            </w:tcBorders>
+            <w:tcMar>
+              <w:top w:type="dxa" w:w="70"/>
+              <w:left w:type="dxa" w:w="90"/>
+              <w:bottom w:type="dxa" w:w="70"/>
+              <w:right w:type="dxa" w:w="90"/>
+            </w:tcMar>
+            <w:vAlign w:val="top"/>
+          </w:tcPr>
+          <w:p>
+            <w:pPr>
+              <w:spacing w:after="0" w:line="250"/>
+            </w:pPr>
+            <w:r>
+              <w:rPr>
+                <w:rFonts w:ascii="Arial" w:cs="Arial" w:eastAsia="Arial" w:hAnsi="Arial"/>
+                <w:b w:val="false"/>
+                <w:bCs w:val="false"/>
+                <w:color w:val="141413"/>
+                <w:sz w:val="17"/>
+                <w:szCs w:val="17"/>
+              </w:rPr>
+              <w:t xml:space="preserve">agent-chat (GitHub issues)</w:t>
+            </w:r>
+          </w:p>
+        </w:tc>
+        <w:tc>
+          <w:tcPr>
+            <w:tcW w:type="dxa" w:w="6624"/>
+            <w:tcBorders>
+              <w:top w:val="single" w:color="D9D6CE" w:sz="4"/>
+              <w:left w:val="none" w:color="FFFFFF" w:sz="0"/>
+              <w:bottom w:val="single" w:color="D9D6CE" w:sz="4"/>
+              <w:right w:val="none" w:color="FFFFFF" w:sz="0"/>
+            </w:tcBorders>
+            <w:tcMar>
+              <w:top w:type="dxa" w:w="70"/>
+              <w:left w:type="dxa" w:w="90"/>
+              <w:bottom w:type="dxa" w:w="70"/>
+              <w:right w:type="dxa" w:w="90"/>
+            </w:tcMar>
+            <w:vAlign w:val="top"/>
+          </w:tcPr>
+          <w:p>
+            <w:pPr>
+              <w:spacing w:after="0" w:line="250"/>
+            </w:pPr>
+            <w:r>
+              <w:rPr>
+                <w:rFonts w:ascii="Arial" w:cs="Arial" w:eastAsia="Arial" w:hAnsi="Arial"/>
+                <w:b w:val="false"/>
+                <w:bCs w:val="false"/>
+                <w:color w:val="141413"/>
+                <w:sz w:val="17"/>
+                <w:szCs w:val="17"/>
+              </w:rPr>
+              <w:t xml:space="preserve">A message bus so Aidan's and Parker's agents could ask each other for data without a human relaying.</w:t>
+            </w:r>
+          </w:p>
+        </w:tc>
+      </w:tr>
+      <w:tr>
+        <w:trPr>
+          <w:cantSplit/>
+        </w:trPr>
+        <w:tc>
+          <w:tcPr>
+            <w:tcW w:type="dxa" w:w="3024"/>
+            <w:tcBorders>
+              <w:top w:val="single" w:color="D9D6CE" w:sz="4"/>
+              <w:left w:val="none" w:color="FFFFFF" w:sz="0"/>
+              <w:bottom w:val="single" w:color="D9D6CE" w:sz="4"/>
+              <w:right w:val="none" w:color="FFFFFF" w:sz="0"/>
+            </w:tcBorders>
+            <w:tcMar>
+              <w:top w:type="dxa" w:w="70"/>
+              <w:left w:type="dxa" w:w="90"/>
+              <w:bottom w:type="dxa" w:w="70"/>
+              <w:right w:type="dxa" w:w="90"/>
+            </w:tcMar>
+            <w:vAlign w:val="top"/>
+          </w:tcPr>
+          <w:p>
+            <w:pPr>
+              <w:spacing w:after="0" w:line="250"/>
+            </w:pPr>
+            <w:r>
+              <w:rPr>
+                <w:rFonts w:ascii="Arial" w:cs="Arial" w:eastAsia="Arial" w:hAnsi="Arial"/>
+                <w:b w:val="false"/>
+                <w:bCs w:val="false"/>
+                <w:color w:val="141413"/>
+                <w:sz w:val="17"/>
+                <w:szCs w:val="17"/>
+              </w:rPr>
+              <w:t xml:space="preserve">Cloudflare R2</w:t>
+            </w:r>
+          </w:p>
+        </w:tc>
+        <w:tc>
+          <w:tcPr>
+            <w:tcW w:type="dxa" w:w="6624"/>
+            <w:tcBorders>
+              <w:top w:val="single" w:color="D9D6CE" w:sz="4"/>
+              <w:left w:val="none" w:color="FFFFFF" w:sz="0"/>
+              <w:bottom w:val="single" w:color="D9D6CE" w:sz="4"/>
+              <w:right w:val="none" w:color="FFFFFF" w:sz="0"/>
+            </w:tcBorders>
+            <w:tcMar>
+              <w:top w:type="dxa" w:w="70"/>
+              <w:left w:type="dxa" w:w="90"/>
+              <w:bottom w:type="dxa" w:w="70"/>
+              <w:right w:type="dxa" w:w="90"/>
+            </w:tcMar>
+            <w:vAlign w:val="top"/>
+          </w:tcPr>
+          <w:p>
+            <w:pPr>
+              <w:spacing w:after="0" w:line="250"/>
+            </w:pPr>
+            <w:r>
+              <w:rPr>
+                <w:rFonts w:ascii="Arial" w:cs="Arial" w:eastAsia="Arial" w:hAnsi="Arial"/>
+                <w:b w:val="false"/>
+                <w:bCs w:val="false"/>
+                <w:color w:val="141413"/>
+                <w:sz w:val="17"/>
+                <w:szCs w:val="17"/>
+              </w:rPr>
+              <w:t xml:space="preserve">Bulk storage for the corpus and the gzipped index, so either machine could rebuild from the same bytes.</w:t>
+            </w:r>
+          </w:p>
+        </w:tc>
+      </w:tr>
+    </w:tbl>
+    <w:p>
+      <w:pPr>
+        <w:pStyle w:val="Heading1"/>
+        <w:spacing w:after="200" w:before="520"/>
+      </w:pPr>
+      <w:r>
+        <w:rPr>
+          <w:rFonts w:ascii="Georgia" w:cs="Georgia" w:eastAsia="Georgia" w:hAnsi="Georgia"/>
+          <w:color w:val="141413"/>
+          <w:sz w:val="38"/>
+          <w:szCs w:val="38"/>
+        </w:rPr>
+        <w:t xml:space="preserve">3. The workflow</w:t>
       </w:r>
     </w:p>
     <w:p>
       <w:pPr>
         <w:pStyle w:val="Heading2"/>
         <w:keepNext/>
-        <w:spacing w:before="320" w:after="120"/>
+        <w:spacing w:after="120" w:before="320"/>
       </w:pPr>
       <w:r>
         <w:rPr>
@@ -1686,7 +1639,7 @@
           <w:sz w:val="27"/>
           <w:szCs w:val="27"/>
         </w:rPr>
-        <w:t xml:space="preserve">3.2 How the work was split between people and tools</w:t>
+        <w:t xml:space="preserve">3.1 How documents got into the AI</w:t>
       </w:r>
     </w:p>
     <w:p>
@@ -1700,7 +1653,7 @@
           <w:sz w:val="21"/>
           <w:szCs w:val="21"/>
         </w:rPr>
-        <w:t xml:space="preserve">Two people ran four long-lived Claude Code sessions, each in its own git worktree with its own branch and pull request. Parker owned the company read, the human judgment on findings, the Part 2 content and the deck. Aidan owned the API key, the repository and PR chain, the UI, the demo, this report and the submission. A fourth session, the watcher, did no building. It checked the other three against their goals, the rubric and the one deadline, and ruled on discrepancies when a refresh moved a published number.</w:t>
+        <w:t xml:space="preserve">We did not paste any document into a prompt. Collectors fetched each filing, transcript, label and dataset by code and wrote page-marked text, with a marker of the form [[page N | printed P]] on every page so that a file page and a printed page could both be cited. The index stores pages, speaker turns and fact rows with full-text search, and every row carries a locator of the form doc_id#p&lt;page&gt; that opens the source.</w:t>
       </w:r>
     </w:p>
     <w:p>
@@ -1714,21 +1667,21 @@
           <w:sz w:val="21"/>
           <w:szCs w:val="21"/>
         </w:rPr>
-        <w:t xml:space="preserve">Parker's branch also carried a nugget miner and a red-team agent that read footnotes, risk language and call Q&amp;A for each company and scored our work against the rubric. We demoted an earlier quantitative league table, which ranked companies by a scoring equation, to internal triage on Saturday evening after a scorer bug misled it (Section 5). Nothing from it appears in the pitch.</w:t>
+        <w:t xml:space="preserve">Two rules made the index trustworthy enough to reason over. The first is verify_quote. A sentence passes only if it is an exact substring of the one page it cites, after quotes, dashes, whitespace and case are normalised. The retrieval helpers drop any row that fails before an agent sees it. The second is grading and flagging. Transcripts are graded A to D and only A and B may be quoted. Bloomberg pages are cited by label and never copied. A mislabeled transcript and a set of fool.com files that open with model-written summaries are marked superseded or unquotable.</w:t>
       </w:r>
     </w:p>
     <w:p>
       <w:pPr>
         <w:keepNext/>
-        <w:spacing w:before="140" w:after="80"/>
+        <w:spacing w:after="80" w:before="140"/>
         <w:jc w:val="center"/>
       </w:pPr>
       <w:r>
         <w:drawing>
           <wp:inline distT="0" distB="0" distL="0" distR="0">
-            <wp:extent cx="4848225" cy="1828800"/>
+            <wp:extent cx="6124575" cy="1323975"/>
             <wp:effectExtent t="0" r="0" b="0" l="0"/>
-            <wp:docPr id="1" name="" descr="" title=""/>
+            <wp:docPr id="3" name="" descr="" title=""/>
             <wp:cNvGraphicFramePr>
               <a:graphicFrameLocks xmlns:a="http://schemas.openxmlformats.org/drawingml/2006/main" noChangeAspect="1"/>
             </wp:cNvGraphicFramePr>
@@ -1751,7 +1704,7 @@
                   <pic:spPr bwMode="auto">
                     <a:xfrm>
                       <a:off x="0" y="0"/>
-                      <a:ext cx="4848225" cy="1828800"/>
+                      <a:ext cx="6124575" cy="1323975"/>
                     </a:xfrm>
                     <a:prstGeom prst="rect">
                       <a:avLst/>
@@ -1776,7 +1729,7 @@
           <w:sz w:val="17"/>
           <w:szCs w:val="17"/>
         </w:rPr>
-        <w:t xml:space="preserve">Figure 4. People, sessions and branches. Sessions messaged each other directly with status, commit SHAs, data inventories and rulings.</w:t>
+        <w:t xml:space="preserve">Figure 3. A document's path into the index. The collectors also keep a log of their own confident mistakes, which became the largest part of our AI-was-wrong record.</w:t>
       </w:r>
     </w:p>
     <w:p>
@@ -1790,14 +1743,14 @@
           <w:sz w:val="21"/>
           <w:szCs w:val="21"/>
         </w:rPr>
-        <w:t xml:space="preserve">Keeping each agent's scope narrow did more for us than any wording in the prompts. Every worker agent opened with the same frame. It is a worker and not an orchestrator, it works only in its own worktree, it owns only the files named, it does not spawn agents, and it reports file paths and counts. No two agents edited the same file all weekend.</w:t>
+        <w:t xml:space="preserve">The scraper session ran five waves on Saturday. The first fetched the ten shortlist companies at filing depth, with ten quarters of graded calls. The second built the Part 2 backend for all ten companies and 52 drugs, covering epidemiology, peers, deals, pipeline, costs and prescribers. The third filled every gap a free source could still fill. The fourth built the eight case helpers. The fifth was a Part 2 evidence wave of labels, head-to-head trials, payer tables, deal comps and 325 page-anchored filing numbers for the three picked companies. Explicit negatives are rows too, so 'no public source' is itself citable.</w:t>
       </w:r>
     </w:p>
     <w:p>
       <w:pPr>
         <w:pStyle w:val="Heading2"/>
         <w:keepNext/>
-        <w:spacing w:before="320" w:after="120"/>
+        <w:spacing w:after="120" w:before="320"/>
       </w:pPr>
       <w:r>
         <w:rPr>
@@ -1806,7 +1759,7 @@
           <w:sz w:val="27"/>
           <w:szCs w:val="27"/>
         </w:rPr>
-        <w:t xml:space="preserve">3.3 Part 1: Find the Story</w:t>
+        <w:t xml:space="preserve">3.2 How the work was split between people and tools</w:t>
       </w:r>
     </w:p>
     <w:p>
@@ -1820,21 +1773,35 @@
           <w:sz w:val="21"/>
           <w:szCs w:val="21"/>
         </w:rPr>
-        <w:t xml:space="preserve">The model session launched ten reader agents, one per company, together on Saturday at 10:27 pm. Each had the case PDF, the rubric, the citation index and a written list of files it was forbidden to open, which covered any prior run, the league table, the nugget files, the red-team notes and every other worktree. Each walked the case's eight hiding places and wrote candidates with page-verified evidence as it found them.</w:t>
+        <w:t xml:space="preserve">Two people ran four long-lived Claude Code sessions, each in its own git worktree with its own branch and pull request. Parker owned the company read, the human judgment on findings and the Part 2 content, and he shaped the judge-facing page himself, editing its layout in the browser. Aidan owned the API key, the repository and PR chain, the UI, the demo and its public copy, the pitch deck, this report and the submission. A fourth session, the watcher, did no building. It checked the other three against their goals, the rubric and the one deadline, and ruled on discrepancies when a refresh moved a published number.</w:t>
+      </w:r>
+    </w:p>
+    <w:p>
+      <w:pPr>
+        <w:spacing w:after="160" w:line="300"/>
+      </w:pPr>
+      <w:r>
+        <w:rPr>
+          <w:rFonts w:ascii="Arial" w:cs="Arial" w:eastAsia="Arial" w:hAnsi="Arial"/>
+          <w:color w:val="141413"/>
+          <w:sz w:val="21"/>
+          <w:szCs w:val="21"/>
+        </w:rPr>
+        <w:t xml:space="preserve">Parker's branch also carried a nugget miner and a red-team agent that read footnotes, risk language and call Q&amp;A for each company and scored our work against the rubric. We demoted an earlier quantitative league table, which ranked companies by a scoring equation, to internal triage on Saturday evening after a scorer bug misled it (Section 5). Nothing from it appears in the pitch.</w:t>
       </w:r>
     </w:p>
     <w:p>
       <w:pPr>
         <w:keepNext/>
-        <w:spacing w:before="140" w:after="80"/>
+        <w:spacing w:after="80" w:before="140"/>
         <w:jc w:val="center"/>
       </w:pPr>
       <w:r>
         <w:drawing>
           <wp:inline distT="0" distB="0" distL="0" distR="0">
-            <wp:extent cx="6124575" cy="2800350"/>
+            <wp:extent cx="4848225" cy="1828800"/>
             <wp:effectExtent t="0" r="0" b="0" l="0"/>
-            <wp:docPr id="1" name="" descr="" title=""/>
+            <wp:docPr id="4" name="" descr="" title=""/>
             <wp:cNvGraphicFramePr>
               <a:graphicFrameLocks xmlns:a="http://schemas.openxmlformats.org/drawingml/2006/main" noChangeAspect="1"/>
             </wp:cNvGraphicFramePr>
@@ -1857,6 +1824,112 @@
                   <pic:spPr bwMode="auto">
                     <a:xfrm>
                       <a:off x="0" y="0"/>
+                      <a:ext cx="4848225" cy="1828800"/>
+                    </a:xfrm>
+                    <a:prstGeom prst="rect">
+                      <a:avLst/>
+                    </a:prstGeom>
+                  </pic:spPr>
+                </pic:pic>
+              </a:graphicData>
+            </a:graphic>
+          </wp:inline>
+        </w:drawing>
+      </w:r>
+    </w:p>
+    <w:p>
+      <w:pPr>
+        <w:spacing w:after="220"/>
+        <w:jc w:val="left"/>
+      </w:pPr>
+      <w:r>
+        <w:rPr>
+          <w:rFonts w:ascii="Arial" w:cs="Arial" w:eastAsia="Arial" w:hAnsi="Arial"/>
+          <w:color w:val="5E5D59"/>
+          <w:sz w:val="17"/>
+          <w:szCs w:val="17"/>
+        </w:rPr>
+        <w:t xml:space="preserve">Figure 4. People, sessions and branches. Sessions messaged each other directly with status, commit SHAs, data inventories and rulings.</w:t>
+      </w:r>
+    </w:p>
+    <w:p>
+      <w:pPr>
+        <w:spacing w:after="160" w:line="300"/>
+      </w:pPr>
+      <w:r>
+        <w:rPr>
+          <w:rFonts w:ascii="Arial" w:cs="Arial" w:eastAsia="Arial" w:hAnsi="Arial"/>
+          <w:color w:val="141413"/>
+          <w:sz w:val="21"/>
+          <w:szCs w:val="21"/>
+        </w:rPr>
+        <w:t xml:space="preserve">Keeping each agent's scope narrow did more for us than any wording in the prompts. Every worker agent opened with the same frame. It is a worker and not an orchestrator, it works only in its own worktree, it owns only the files named, it does not spawn agents, and it reports file paths and counts. No two agents edited the same file all weekend.</w:t>
+      </w:r>
+    </w:p>
+    <w:p>
+      <w:pPr>
+        <w:pStyle w:val="Heading2"/>
+        <w:keepNext/>
+        <w:spacing w:after="120" w:before="320"/>
+      </w:pPr>
+      <w:r>
+        <w:rPr>
+          <w:rFonts w:ascii="Georgia" w:cs="Georgia" w:eastAsia="Georgia" w:hAnsi="Georgia"/>
+          <w:color w:val="141413"/>
+          <w:sz w:val="27"/>
+          <w:szCs w:val="27"/>
+        </w:rPr>
+        <w:t xml:space="preserve">3.3 Part 1: Find the Story</w:t>
+      </w:r>
+    </w:p>
+    <w:p>
+      <w:pPr>
+        <w:spacing w:after="160" w:line="300"/>
+      </w:pPr>
+      <w:r>
+        <w:rPr>
+          <w:rFonts w:ascii="Arial" w:cs="Arial" w:eastAsia="Arial" w:hAnsi="Arial"/>
+          <w:color w:val="141413"/>
+          <w:sz w:val="21"/>
+          <w:szCs w:val="21"/>
+        </w:rPr>
+        <w:t xml:space="preserve">The model session launched ten reader agents, one per company, together on Saturday at 10:27 pm. Each had the case PDF, the rubric, the citation index and a written list of files it was forbidden to open, which covered any prior run, the league table, the nugget files, the red-team notes and every other worktree. Each walked the case's eight hiding places and wrote candidates with page-verified evidence as it found them.</w:t>
+      </w:r>
+    </w:p>
+    <w:p>
+      <w:pPr>
+        <w:keepNext/>
+        <w:spacing w:after="80" w:before="140"/>
+        <w:jc w:val="center"/>
+      </w:pPr>
+      <w:r>
+        <w:drawing>
+          <wp:inline distT="0" distB="0" distL="0" distR="0">
+            <wp:extent cx="6124575" cy="2800350"/>
+            <wp:effectExtent t="0" r="0" b="0" l="0"/>
+            <wp:docPr id="5" name="" descr="" title=""/>
+            <wp:cNvGraphicFramePr>
+              <a:graphicFrameLocks xmlns:a="http://schemas.openxmlformats.org/drawingml/2006/main" noChangeAspect="1"/>
+            </wp:cNvGraphicFramePr>
+            <a:graphic xmlns:a="http://schemas.openxmlformats.org/drawingml/2006/main">
+              <a:graphicData uri="http://schemas.openxmlformats.org/drawingml/2006/picture">
+                <pic:pic xmlns:pic="http://schemas.openxmlformats.org/drawingml/2006/picture">
+                  <pic:nvPicPr>
+                    <pic:cNvPr id="0" name="" descr=""/>
+                    <pic:cNvPicPr>
+                      <a:picLocks noChangeAspect="1" noChangeArrowheads="1"/>
+                    </pic:cNvPicPr>
+                  </pic:nvPicPr>
+                  <pic:blipFill>
+                    <a:blip r:embed="rId12" cstate="none"/>
+                    <a:srcRect/>
+                    <a:stretch>
+                      <a:fillRect/>
+                    </a:stretch>
+                  </pic:blipFill>
+                  <pic:spPr bwMode="auto">
+                    <a:xfrm>
+                      <a:off x="0" y="0"/>
                       <a:ext cx="6124575" cy="2800350"/>
                     </a:xfrm>
                     <a:prstGeom prst="rect">
@@ -2523,7 +2596,7 @@
       <w:pPr>
         <w:pStyle w:val="Heading2"/>
         <w:keepNext/>
-        <w:spacing w:before="320" w:after="120"/>
+        <w:spacing w:after="120" w:before="320"/>
       </w:pPr>
       <w:r>
         <w:rPr>
@@ -2552,7 +2625,7 @@
     <w:p>
       <w:pPr>
         <w:keepNext/>
-        <w:spacing w:before="140" w:after="80"/>
+        <w:spacing w:after="80" w:before="140"/>
         <w:jc w:val="center"/>
       </w:pPr>
       <w:r>
@@ -2560,7 +2633,7 @@
           <wp:inline distT="0" distB="0" distL="0" distR="0">
             <wp:extent cx="6124575" cy="1905000"/>
             <wp:effectExtent t="0" r="0" b="0" l="0"/>
-            <wp:docPr id="1" name="" descr="" title=""/>
+            <wp:docPr id="6" name="" descr="" title=""/>
             <wp:cNvGraphicFramePr>
               <a:graphicFrameLocks xmlns:a="http://schemas.openxmlformats.org/drawingml/2006/main" noChangeAspect="1"/>
             </wp:cNvGraphicFramePr>
@@ -2574,7 +2647,7 @@
                     </pic:cNvPicPr>
                   </pic:nvPicPr>
                   <pic:blipFill>
-                    <a:blip r:embed="rId12" cstate="none"/>
+                    <a:blip r:embed="rId13" cstate="none"/>
                     <a:srcRect/>
                     <a:stretch>
                       <a:fillRect/>
@@ -3221,7 +3294,7 @@
       <w:pPr>
         <w:pStyle w:val="Heading2"/>
         <w:keepNext/>
-        <w:spacing w:before="320" w:after="120"/>
+        <w:spacing w:after="120" w:before="320"/>
       </w:pPr>
       <w:r>
         <w:rPr>
@@ -3250,7 +3323,7 @@
     <w:p>
       <w:pPr>
         <w:keepNext/>
-        <w:spacing w:before="140" w:after="80"/>
+        <w:spacing w:after="80" w:before="140"/>
         <w:jc w:val="center"/>
       </w:pPr>
       <w:r>
@@ -3258,7 +3331,7 @@
           <wp:inline distT="0" distB="0" distL="0" distR="0">
             <wp:extent cx="6124575" cy="1895475"/>
             <wp:effectExtent t="0" r="0" b="0" l="0"/>
-            <wp:docPr id="1" name="" descr="" title=""/>
+            <wp:docPr id="7" name="" descr="" title=""/>
             <wp:cNvGraphicFramePr>
               <a:graphicFrameLocks xmlns:a="http://schemas.openxmlformats.org/drawingml/2006/main" noChangeAspect="1"/>
             </wp:cNvGraphicFramePr>
@@ -3272,7 +3345,7 @@
                     </pic:cNvPicPr>
                   </pic:nvPicPr>
                   <pic:blipFill>
-                    <a:blip r:embed="rId13" cstate="none"/>
+                    <a:blip r:embed="rId14" cstate="none"/>
                     <a:srcRect/>
                     <a:stretch>
                       <a:fillRect/>
@@ -3475,8 +3548,66 @@
     </w:p>
     <w:p>
       <w:pPr>
+        <w:pStyle w:val="Heading2"/>
+        <w:keepNext/>
+        <w:spacing w:after="120" w:before="320"/>
+      </w:pPr>
+      <w:r>
+        <w:rPr>
+          <w:rFonts w:ascii="Georgia" w:cs="Georgia" w:eastAsia="Georgia" w:hAnsi="Georgia"/>
+          <w:color w:val="141413"/>
+          <w:sz w:val="27"/>
+          <w:szCs w:val="27"/>
+        </w:rPr>
+        <w:t xml:space="preserve">3.6 Getting it in front of judges</w:t>
+      </w:r>
+    </w:p>
+    <w:p>
+      <w:pPr>
+        <w:spacing w:after="160" w:line="300"/>
+      </w:pPr>
+      <w:r>
+        <w:rPr>
+          <w:rFonts w:ascii="Arial" w:cs="Arial" w:eastAsia="Arial" w:hAnsi="Arial"/>
+          <w:color w:val="141413"/>
+          <w:sz w:val="21"/>
+          <w:szCs w:val="21"/>
+        </w:rPr>
+        <w:t xml:space="preserve">The last morning went into making the work easy for a judge to read without changing a single cited number. The chat took the name Needle in the Haystack and a haystack theme, and its two prompts were relabelled Find the needle and The CEO Move, with the case's own Part 1 and Part 2 kept beside them on the slides. Answers now open with what the case grades first. The product answer leads with what limits growth and the tie to the numbers, and the CEO Move leads with what it should return. When that summary started repeating the detail below it, the expandable section was cut back to only what the summary leaves out.</w:t>
+      </w:r>
+    </w:p>
+    <w:p>
+      <w:pPr>
+        <w:spacing w:after="160" w:line="300"/>
+      </w:pPr>
+      <w:r>
+        <w:rPr>
+          <w:rFonts w:ascii="Arial" w:cs="Arial" w:eastAsia="Arial" w:hAnsi="Arial"/>
+          <w:color w:val="141413"/>
+          <w:sz w:val="21"/>
+          <w:szCs w:val="21"/>
+        </w:rPr>
+        <w:t xml:space="preserve">The judge-facing page lives on Parker's claude.ai artifact, which needs a login to open. We published an exact copy to GitHub Pages so the QR code on the deck opens it on any phone. The copy is a snapshot, so each change to the artifact is pushed to it again, and we check that the two match by file fingerprint.</w:t>
+      </w:r>
+    </w:p>
+    <w:p>
+      <w:pPr>
+        <w:spacing w:after="160" w:line="300"/>
+      </w:pPr>
+      <w:r>
+        <w:rPr>
+          <w:rFonts w:ascii="Arial" w:cs="Arial" w:eastAsia="Arial" w:hAnsi="Arial"/>
+          <w:color w:val="141413"/>
+          <w:sz w:val="21"/>
+          <w:szCs w:val="21"/>
+        </w:rPr>
+        <w:t xml:space="preserve">The deck went through the same adversarial pattern as the analysis. A skeptic agent reviewed PowerPoint renders of every slide for gaps, sizing, alignment and arrows over three rounds; it flagged 25 problems in the first round and two in the last, and every slide passed. A second skeptic read every line of slide text and speaker notes for machine-sounding phrasing and proposed 30 rewrites that kept each number, citation and asterisk. We applied most of them, and overrode the ones that would have made a claim less accurate (Section 5).</w:t>
+      </w:r>
+    </w:p>
+    <w:p>
+      <w:pPr>
         <w:pStyle w:val="Heading1"/>
-        <w:spacing w:before="520" w:after="200"/>
+        <w:spacing w:after="200" w:before="520"/>
       </w:pPr>
       <w:r>
         <w:rPr>
@@ -3505,7 +3636,7 @@
     <w:p>
       <w:pPr>
         <w:keepNext/>
-        <w:spacing w:before="200" w:after="60"/>
+        <w:spacing w:after="60" w:before="200"/>
       </w:pPr>
       <w:r>
         <w:rPr>
@@ -3706,7 +3837,7 @@
     <w:p>
       <w:pPr>
         <w:keepNext/>
-        <w:spacing w:before="200" w:after="60"/>
+        <w:spacing w:after="60" w:before="200"/>
       </w:pPr>
       <w:r>
         <w:rPr>
@@ -3781,7 +3912,7 @@
     <w:p>
       <w:pPr>
         <w:keepNext/>
-        <w:spacing w:before="200" w:after="60"/>
+        <w:spacing w:after="60" w:before="200"/>
       </w:pPr>
       <w:r>
         <w:rPr>
@@ -3856,7 +3987,7 @@
     <w:p>
       <w:pPr>
         <w:keepNext/>
-        <w:spacing w:before="200" w:after="60"/>
+        <w:spacing w:after="60" w:before="200"/>
       </w:pPr>
       <w:r>
         <w:rPr>
@@ -3931,7 +4062,7 @@
     <w:p>
       <w:pPr>
         <w:keepNext/>
-        <w:spacing w:before="200" w:after="60"/>
+        <w:spacing w:after="60" w:before="200"/>
       </w:pPr>
       <w:r>
         <w:rPr>
@@ -4006,7 +4137,7 @@
     <w:p>
       <w:pPr>
         <w:keepNext/>
-        <w:spacing w:before="200" w:after="60"/>
+        <w:spacing w:after="60" w:before="200"/>
       </w:pPr>
       <w:r>
         <w:rPr>
@@ -4081,7 +4212,7 @@
     <w:p>
       <w:pPr>
         <w:keepNext/>
-        <w:spacing w:before="200" w:after="60"/>
+        <w:spacing w:after="60" w:before="200"/>
       </w:pPr>
       <w:r>
         <w:rPr>
@@ -4156,7 +4287,7 @@
     <w:p>
       <w:pPr>
         <w:keepNext/>
-        <w:spacing w:before="200" w:after="60"/>
+        <w:spacing w:after="60" w:before="200"/>
       </w:pPr>
       <w:r>
         <w:rPr>
@@ -4259,7 +4390,7 @@
     <w:p>
       <w:pPr>
         <w:pStyle w:val="Heading1"/>
-        <w:spacing w:before="520" w:after="200"/>
+        <w:spacing w:after="200" w:before="520"/>
       </w:pPr>
       <w:r>
         <w:rPr>
@@ -4282,7 +4413,7 @@
           <w:sz w:val="21"/>
           <w:szCs w:val="21"/>
         </w:rPr>
-        <w:t xml:space="preserve">We kept a log. The collectors recorded 516 cases where a model wrote something the source did not say, each with what it wrote, what the page says and how it was caught. The model and findings work added 26 more. The table picks the cases that changed how we built, grouped by what caught them.</w:t>
+        <w:t xml:space="preserve">We kept a log. The collectors recorded 516 cases where a model wrote something the source did not say, each with what it wrote, what the page says and how it was caught. The model, findings and deck work added 27 more. The table picks the cases that changed how we built, grouped by what caught them.</w:t>
       </w:r>
     </w:p>
     <w:tbl>
@@ -6033,6 +6164,147 @@
                 <w:sz w:val="16"/>
                 <w:szCs w:val="16"/>
               </w:rPr>
+              <w:t xml:space="preserve">A copy-editing agent rewrote Repatha's label row, 'CV outcomes incl. revascularization', as 'Heart events + stents' to make it plainer.</w:t>
+            </w:r>
+          </w:p>
+        </w:tc>
+        <w:tc>
+          <w:tcPr>
+            <w:tcW w:type="dxa" w:w="2592"/>
+            <w:tcBorders>
+              <w:top w:val="single" w:color="D9D6CE" w:sz="4"/>
+              <w:left w:val="none" w:color="FFFFFF" w:sz="0"/>
+              <w:bottom w:val="single" w:color="D9D6CE" w:sz="4"/>
+              <w:right w:val="none" w:color="FFFFFF" w:sz="0"/>
+            </w:tcBorders>
+            <w:tcMar>
+              <w:top w:type="dxa" w:w="70"/>
+              <w:left w:type="dxa" w:w="90"/>
+              <w:bottom w:type="dxa" w:w="70"/>
+              <w:right w:type="dxa" w:w="90"/>
+            </w:tcMar>
+            <w:vAlign w:val="top"/>
+          </w:tcPr>
+          <w:p>
+            <w:pPr>
+              <w:spacing w:after="0" w:line="220"/>
+            </w:pPr>
+            <w:r>
+              <w:rPr>
+                <w:rFonts w:ascii="Arial" w:cs="Arial" w:eastAsia="Arial" w:hAnsi="Arial"/>
+                <w:b w:val="false"/>
+                <w:bCs w:val="false"/>
+                <w:color w:val="141413"/>
+                <w:sz w:val="16"/>
+                <w:szCs w:val="16"/>
+              </w:rPr>
+              <w:t xml:space="preserve">The label's coronary revascularization covers bypass surgery as well as stents, so the plainer line understated the label edge.</w:t>
+            </w:r>
+          </w:p>
+        </w:tc>
+        <w:tc>
+          <w:tcPr>
+            <w:tcW w:type="dxa" w:w="1872"/>
+            <w:tcBorders>
+              <w:top w:val="single" w:color="D9D6CE" w:sz="4"/>
+              <w:left w:val="none" w:color="FFFFFF" w:sz="0"/>
+              <w:bottom w:val="single" w:color="D9D6CE" w:sz="4"/>
+              <w:right w:val="none" w:color="FFFFFF" w:sz="0"/>
+            </w:tcBorders>
+            <w:tcMar>
+              <w:top w:type="dxa" w:w="70"/>
+              <w:left w:type="dxa" w:w="90"/>
+              <w:bottom w:type="dxa" w:w="70"/>
+              <w:right w:type="dxa" w:w="90"/>
+            </w:tcMar>
+            <w:vAlign w:val="top"/>
+          </w:tcPr>
+          <w:p>
+            <w:pPr>
+              <w:spacing w:after="0" w:line="220"/>
+            </w:pPr>
+            <w:r>
+              <w:rPr>
+                <w:rFonts w:ascii="Arial" w:cs="Arial" w:eastAsia="Arial" w:hAnsi="Arial"/>
+                <w:b w:val="false"/>
+                <w:bCs w:val="false"/>
+                <w:color w:val="141413"/>
+                <w:sz w:val="16"/>
+                <w:szCs w:val="16"/>
+              </w:rPr>
+              <w:t xml:space="preserve">The orchestrator checking each wording change against the cited label before applying it.</w:t>
+            </w:r>
+          </w:p>
+        </w:tc>
+        <w:tc>
+          <w:tcPr>
+            <w:tcW w:type="dxa" w:w="2592"/>
+            <w:tcBorders>
+              <w:top w:val="single" w:color="D9D6CE" w:sz="4"/>
+              <w:left w:val="none" w:color="FFFFFF" w:sz="0"/>
+              <w:bottom w:val="single" w:color="D9D6CE" w:sz="4"/>
+              <w:right w:val="none" w:color="FFFFFF" w:sz="0"/>
+            </w:tcBorders>
+            <w:tcMar>
+              <w:top w:type="dxa" w:w="70"/>
+              <w:left w:type="dxa" w:w="90"/>
+              <w:bottom w:type="dxa" w:w="70"/>
+              <w:right w:type="dxa" w:w="90"/>
+            </w:tcMar>
+            <w:vAlign w:val="top"/>
+          </w:tcPr>
+          <w:p>
+            <w:pPr>
+              <w:spacing w:after="0" w:line="220"/>
+            </w:pPr>
+            <w:r>
+              <w:rPr>
+                <w:rFonts w:ascii="Arial" w:cs="Arial" w:eastAsia="Arial" w:hAnsi="Arial"/>
+                <w:b w:val="false"/>
+                <w:bCs w:val="false"/>
+                <w:color w:val="141413"/>
+                <w:sz w:val="16"/>
+                <w:szCs w:val="16"/>
+              </w:rPr>
+              <w:t xml:space="preserve">A rewrite that touches a factual claim is checked against its source first. The row now reads 'Heart events + procedures'.</w:t>
+            </w:r>
+          </w:p>
+        </w:tc>
+      </w:tr>
+      <w:tr>
+        <w:trPr>
+          <w:cantSplit/>
+        </w:trPr>
+        <w:tc>
+          <w:tcPr>
+            <w:tcW w:type="dxa" w:w="2592"/>
+            <w:tcBorders>
+              <w:top w:val="single" w:color="D9D6CE" w:sz="4"/>
+              <w:left w:val="none" w:color="FFFFFF" w:sz="0"/>
+              <w:bottom w:val="single" w:color="D9D6CE" w:sz="4"/>
+              <w:right w:val="none" w:color="FFFFFF" w:sz="0"/>
+            </w:tcBorders>
+            <w:tcMar>
+              <w:top w:type="dxa" w:w="70"/>
+              <w:left w:type="dxa" w:w="90"/>
+              <w:bottom w:type="dxa" w:w="70"/>
+              <w:right w:type="dxa" w:w="90"/>
+            </w:tcMar>
+            <w:vAlign w:val="top"/>
+          </w:tcPr>
+          <w:p>
+            <w:pPr>
+              <w:spacing w:after="0" w:line="220"/>
+            </w:pPr>
+            <w:r>
+              <w:rPr>
+                <w:rFonts w:ascii="Arial" w:cs="Arial" w:eastAsia="Arial" w:hAnsi="Arial"/>
+                <w:b w:val="false"/>
+                <w:bCs w:val="false"/>
+                <w:color w:val="141413"/>
+                <w:sz w:val="16"/>
+                <w:szCs w:val="16"/>
+              </w:rPr>
               <w:t xml:space="preserve">A $100 billion market forecast recorded as an upfront deal payment, and a takeover target's market cap 50 times too high from pricing ordinary shares at the ADS rate.</w:t>
             </w:r>
           </w:p>
@@ -6151,7 +6423,7 @@
         <w:pBdr>
           <w:left w:val="single" w:color="D97757" w:sz="18" w:space="12"/>
         </w:pBdr>
-        <w:spacing w:before="60" w:after="60" w:line="320"/>
+        <w:spacing w:after="60" w:before="60" w:line="320"/>
         <w:ind w:left="360" w:right="720"/>
       </w:pPr>
       <w:r>
@@ -6201,7 +6473,7 @@
     <w:p>
       <w:pPr>
         <w:pStyle w:val="Heading1"/>
-        <w:spacing w:before="520" w:after="200"/>
+        <w:spacing w:after="200" w:before="520"/>
       </w:pPr>
       <w:r>
         <w:rPr>
@@ -6471,7 +6743,7 @@
           <w:sz w:val="21"/>
           <w:szCs w:val="21"/>
         </w:rPr>
-        <w:t xml:space="preserve">Write partial output early and keep per-worker scratch space. </w:t>
+        <w:t xml:space="preserve">Get product-level analyst estimates. </w:t>
       </w:r>
       <w:r>
         <w:rPr>
@@ -6480,13 +6752,73 @@
           <w:sz w:val="21"/>
           <w:szCs w:val="21"/>
         </w:rPr>
+        <w:t xml:space="preserve">Our consensus data is company-level, so every priced-in call is an inference from how often analysts asked and how the stock moved, and none rates above medium confidence. Product-level estimates would let us test the call directly.</w:t>
+      </w:r>
+    </w:p>
+    <w:p>
+      <w:pPr>
+        <w:pStyle w:val="ListParagraph"/>
+        <w:numPr>
+          <w:ilvl w:val="0"/>
+          <w:numId w:val="3"/>
+        </w:numPr>
+        <w:spacing w:after="90" w:line="290"/>
+      </w:pPr>
+      <w:r>
+        <w:rPr>
+          <w:rFonts w:ascii="Arial" w:cs="Arial" w:eastAsia="Arial" w:hAnsi="Arial"/>
+          <w:b/>
+          <w:bCs/>
+          <w:color w:val="141413"/>
+          <w:sz w:val="21"/>
+          <w:szCs w:val="21"/>
+        </w:rPr>
+        <w:t xml:space="preserve">Publish where judges can open it from the start. </w:t>
+      </w:r>
+      <w:r>
+        <w:rPr>
+          <w:rFonts w:ascii="Arial" w:cs="Arial" w:eastAsia="Arial" w:hAnsi="Arial"/>
+          <w:color w:val="141413"/>
+          <w:sz w:val="21"/>
+          <w:szCs w:val="21"/>
+        </w:rPr>
+        <w:t xml:space="preserve">The demo lived behind a claude.ai login until the last morning, when we copied it to a public page. A public URL on day one would have saved a scramble.</w:t>
+      </w:r>
+    </w:p>
+    <w:p>
+      <w:pPr>
+        <w:pStyle w:val="ListParagraph"/>
+        <w:numPr>
+          <w:ilvl w:val="0"/>
+          <w:numId w:val="3"/>
+        </w:numPr>
+        <w:spacing w:after="90" w:line="290"/>
+      </w:pPr>
+      <w:r>
+        <w:rPr>
+          <w:rFonts w:ascii="Arial" w:cs="Arial" w:eastAsia="Arial" w:hAnsi="Arial"/>
+          <w:b/>
+          <w:bCs/>
+          <w:color w:val="141413"/>
+          <w:sz w:val="21"/>
+          <w:szCs w:val="21"/>
+        </w:rPr>
+        <w:t xml:space="preserve">Write partial output early and keep per-worker scratch space. </w:t>
+      </w:r>
+      <w:r>
+        <w:rPr>
+          <w:rFonts w:ascii="Arial" w:cs="Arial" w:eastAsia="Arial" w:hAnsi="Arial"/>
+          <w:color w:val="141413"/>
+          <w:sz w:val="21"/>
+          <w:szCs w:val="21"/>
+        </w:rPr>
         <w:t xml:space="preserve">The host machine slept mid-run once, and parallel workers collided on a shared folder once. Both are avoidable.</w:t>
       </w:r>
     </w:p>
     <w:p>
       <w:pPr>
         <w:pStyle w:val="Heading1"/>
-        <w:spacing w:before="520" w:after="200"/>
+        <w:spacing w:after="200" w:before="520"/>
       </w:pPr>
       <w:r>
         <w:rPr>
@@ -6531,7 +6863,7 @@
         <w:pBdr>
           <w:bottom w:val="single" w:color="D9D6CE" w:sz="6" w:space="1"/>
         </w:pBdr>
-        <w:spacing w:before="200" w:after="120"/>
+        <w:spacing w:after="120" w:before="200"/>
       </w:pPr>
     </w:p>
     <w:p>
@@ -6545,7 +6877,7 @@
           <w:sz w:val="16"/>
           <w:szCs w:val="16"/>
         </w:rPr>
-        <w:t xml:space="preserve">Repository: aidanmcjones/neeley-ai-forward. Final commits: data-moat ce3c0f2, quant-model 2460a00, ui 2401772. Sealed selection sha256 903fc656fa7a1d1b2bdf303d8d8f9321d5f1f7b741f6b751c4cdf4f9c40c8fa7.</w:t>
+        <w:t xml:space="preserve">Repository: aidanmcjones/neeley-ai-forward. Final commits: data-moat ce3c0f2, ui 9f064c4, quant-model at the commit that carries this report. Public demo: aidanmcjones.github.io/needle-demo. Sealed selection sha256 903fc656fa7a1d1b2bdf303d8d8f9321d5f1f7b741f6b751c4cdf4f9c40c8fa7.</w:t>
       </w:r>
     </w:p>
     <w:sectPr>
@@ -6559,8 +6891,41 @@
 </w:document>
 </file>
 
-<file path=word/comments.xml><?xml version="1.0" encoding="utf-8"?>
-<w:comments xmlns:cx="http://schemas.microsoft.com/office/drawing/2014/chartex" xmlns:cx1="http://schemas.microsoft.com/office/drawing/2015/9/8/chartex" xmlns:cx2="http://schemas.microsoft.com/office/drawing/2015/10/21/chartex" xmlns:cx3="http://schemas.microsoft.com/office/drawing/2016/5/9/chartex" xmlns:cx4="http://schemas.microsoft.com/office/drawing/2016/5/10/chartex" xmlns:cx5="http://schemas.microsoft.com/office/drawing/2016/5/11/chartex" xmlns:cx6="http://schemas.microsoft.com/office/drawing/2016/5/12/chartex" xmlns:cx7="http://schemas.microsoft.com/office/drawing/2016/5/13/chartex" xmlns:cx8="http://schemas.microsoft.com/office/drawing/2016/5/14/chartex" xmlns:mc="http://schemas.openxmlformats.org/markup-compatibility/2006" xmlns:aink="http://schemas.microsoft.com/office/drawing/2016/ink" xmlns:am3d="http://schemas.microsoft.com/office/drawing/2017/model3d" xmlns:o="urn:schemas-microsoft-com:office:office" xmlns:r="http://schemas.openxmlformats.org/officeDocument/2006/relationships" xmlns:m="http://schemas.openxmlformats.org/officeDocument/2006/math" xmlns:v="urn:schemas-microsoft-com:vml" xmlns:wp14="http://schemas.microsoft.com/office/word/2010/wordprocessingDrawing" xmlns:wp="http://schemas.openxmlformats.org/drawingml/2006/wordprocessingDrawing" xmlns:w10="urn:schemas-microsoft-com:office:word" xmlns:w="http://schemas.openxmlformats.org/wordprocessingml/2006/main" xmlns:w14="http://schemas.microsoft.com/office/word/2010/wordml" xmlns:w15="http://schemas.microsoft.com/office/word/2012/wordml" xmlns:w16cex="http://schemas.microsoft.com/office/word/2018/wordml/cex" xmlns:w16cid="http://schemas.microsoft.com/office/word/2016/wordml/cid" xmlns:w16="http://schemas.microsoft.com/office/word/2018/wordml" xmlns:w16sdtdh="http://schemas.microsoft.com/office/word/2020/wordml/sdtdatahash" xmlns:w16se="http://schemas.microsoft.com/office/word/2015/wordml/symex" xmlns:wpg="http://schemas.microsoft.com/office/word/2010/wordprocessingGroup" xmlns:wpi="http://schemas.microsoft.com/office/word/2010/wordprocessingInk" xmlns:wne="http://schemas.microsoft.com/office/word/2006/wordml" xmlns:wps="http://schemas.microsoft.com/office/word/2010/wordprocessingShape"/>
+<file path=word/endnotes.xml><?xml version="1.0" encoding="utf-8"?>
+<w:endnotes xmlns:wpc="http://schemas.microsoft.com/office/word/2010/wordprocessingCanvas" xmlns:mc="http://schemas.openxmlformats.org/markup-compatibility/2006" xmlns:o="urn:schemas-microsoft-com:office:office" xmlns:r="http://schemas.openxmlformats.org/officeDocument/2006/relationships" xmlns:m="http://schemas.openxmlformats.org/officeDocument/2006/math" xmlns:v="urn:schemas-microsoft-com:vml" xmlns:wp14="http://schemas.microsoft.com/office/word/2010/wordprocessingDrawing" xmlns:wp="http://schemas.openxmlformats.org/drawingml/2006/wordprocessingDrawing" xmlns:w10="urn:schemas-microsoft-com:office:word" xmlns:w="http://schemas.openxmlformats.org/wordprocessingml/2006/main" xmlns:w14="http://schemas.microsoft.com/office/word/2010/wordml" xmlns:w15="http://schemas.microsoft.com/office/word/2012/wordml" xmlns:wpg="http://schemas.microsoft.com/office/word/2010/wordprocessingGroup" xmlns:wpi="http://schemas.microsoft.com/office/word/2010/wordprocessingInk" xmlns:wne="http://schemas.microsoft.com/office/word/2006/wordml" xmlns:wps="http://schemas.microsoft.com/office/word/2010/wordprocessingShape" mc:Ignorable="w14 w15 wp14">
+  <w:endnote w:type="separator" w:id="-1">
+    <w:p>
+      <w:pPr>
+        <w:spacing w:after="0" w:line="240" w:lineRule="auto"/>
+      </w:pPr>
+      <w:r>
+        <w:rPr>
+          <w:rStyle w:val="EndnoteReference"/>
+        </w:rPr>
+        <w:endnoteRef/>
+      </w:r>
+      <w:r>
+        <w:separator/>
+      </w:r>
+    </w:p>
+  </w:endnote>
+  <w:endnote w:type="continuationSeparator" w:id="0">
+    <w:p>
+      <w:pPr>
+        <w:spacing w:after="0" w:line="240" w:lineRule="auto"/>
+      </w:pPr>
+      <w:r>
+        <w:rPr>
+          <w:rStyle w:val="EndnoteReference"/>
+        </w:rPr>
+        <w:endnoteRef/>
+      </w:r>
+      <w:r>
+        <w:continuationSeparator/>
+      </w:r>
+    </w:p>
+  </w:endnote>
+</w:endnotes>
 </file>
 
 <file path=word/footer1.xml><?xml version="1.0" encoding="utf-8"?>
@@ -6596,8 +6961,32 @@
         <w:szCs w:val="15"/>
       </w:rPr>
       <w:fldChar w:fldCharType="begin"/>
+    </w:r>
+    <w:r>
+      <w:rPr>
+        <w:rFonts w:ascii="Arial" w:cs="Arial" w:eastAsia="Arial" w:hAnsi="Arial"/>
+        <w:color w:val="5E5D59"/>
+        <w:sz w:val="15"/>
+        <w:szCs w:val="15"/>
+      </w:rPr>
       <w:instrText xml:space="preserve">PAGE</w:instrText>
+    </w:r>
+    <w:r>
+      <w:rPr>
+        <w:rFonts w:ascii="Arial" w:cs="Arial" w:eastAsia="Arial" w:hAnsi="Arial"/>
+        <w:color w:val="5E5D59"/>
+        <w:sz w:val="15"/>
+        <w:szCs w:val="15"/>
+      </w:rPr>
       <w:fldChar w:fldCharType="separate"/>
+    </w:r>
+    <w:r>
+      <w:rPr>
+        <w:rFonts w:ascii="Arial" w:cs="Arial" w:eastAsia="Arial" w:hAnsi="Arial"/>
+        <w:color w:val="5E5D59"/>
+        <w:sz w:val="15"/>
+        <w:szCs w:val="15"/>
+      </w:rPr>
       <w:fldChar w:fldCharType="end"/>
     </w:r>
   </w:p>
@@ -6645,7 +7034,7 @@
 <w:numbering xmlns:wpc="http://schemas.microsoft.com/office/word/2010/wordprocessingCanvas" xmlns:mc="http://schemas.openxmlformats.org/markup-compatibility/2006" xmlns:o="urn:schemas-microsoft-com:office:office" xmlns:r="http://schemas.openxmlformats.org/officeDocument/2006/relationships" xmlns:m="http://schemas.openxmlformats.org/officeDocument/2006/math" xmlns:v="urn:schemas-microsoft-com:vml" xmlns:wp14="http://schemas.microsoft.com/office/word/2010/wordprocessingDrawing" xmlns:wp="http://schemas.openxmlformats.org/drawingml/2006/wordprocessingDrawing" xmlns:w10="urn:schemas-microsoft-com:office:word" xmlns:w="http://schemas.openxmlformats.org/wordprocessingml/2006/main" xmlns:w14="http://schemas.microsoft.com/office/word/2010/wordml" xmlns:w15="http://schemas.microsoft.com/office/word/2012/wordml" xmlns:wpg="http://schemas.microsoft.com/office/word/2010/wordprocessingGroup" xmlns:wpi="http://schemas.microsoft.com/office/word/2010/wordprocessingInk" xmlns:wne="http://schemas.microsoft.com/office/word/2006/wordml" xmlns:wps="http://schemas.microsoft.com/office/word/2010/wordprocessingShape" mc:Ignorable="w14 w15 wp14">
   <w:abstractNum w:abstractNumId="1" w15:restartNumberingAfterBreak="0">
     <w:multiLevelType w:val="hybridMultilevel"/>
-    <w:lvl w:ilvl="0" w15:tentative="1">
+    <w:lvl w:ilvl="0" w:tentative="1">
       <w:start w:val="1"/>
       <w:numFmt w:val="bullet"/>
       <w:lvlText w:val="●"/>
@@ -6654,7 +7043,7 @@
         <w:ind w:left="720" w:hanging="360"/>
       </w:pPr>
     </w:lvl>
-    <w:lvl w:ilvl="1" w15:tentative="1">
+    <w:lvl w:ilvl="1" w:tentative="1">
       <w:start w:val="1"/>
       <w:numFmt w:val="bullet"/>
       <w:lvlText w:val="○"/>
@@ -6663,7 +7052,7 @@
         <w:ind w:left="1440" w:hanging="360"/>
       </w:pPr>
     </w:lvl>
-    <w:lvl w:ilvl="2" w15:tentative="1">
+    <w:lvl w:ilvl="2" w:tentative="1">
       <w:start w:val="1"/>
       <w:numFmt w:val="bullet"/>
       <w:lvlText w:val="■"/>
@@ -6672,7 +7061,7 @@
         <w:ind w:left="2160" w:hanging="360"/>
       </w:pPr>
     </w:lvl>
-    <w:lvl w:ilvl="3" w15:tentative="1">
+    <w:lvl w:ilvl="3" w:tentative="1">
       <w:start w:val="1"/>
       <w:numFmt w:val="bullet"/>
       <w:lvlText w:val="●"/>
@@ -6681,7 +7070,7 @@
         <w:ind w:left="2880" w:hanging="360"/>
       </w:pPr>
     </w:lvl>
-    <w:lvl w:ilvl="4" w15:tentative="1">
+    <w:lvl w:ilvl="4" w:tentative="1">
       <w:start w:val="1"/>
       <w:numFmt w:val="bullet"/>
       <w:lvlText w:val="○"/>
@@ -6690,7 +7079,7 @@
         <w:ind w:left="3600" w:hanging="360"/>
       </w:pPr>
     </w:lvl>
-    <w:lvl w:ilvl="5" w15:tentative="1">
+    <w:lvl w:ilvl="5" w:tentative="1">
       <w:start w:val="1"/>
       <w:numFmt w:val="bullet"/>
       <w:lvlText w:val="■"/>
@@ -6699,7 +7088,7 @@
         <w:ind w:left="4320" w:hanging="360"/>
       </w:pPr>
     </w:lvl>
-    <w:lvl w:ilvl="6" w15:tentative="1">
+    <w:lvl w:ilvl="6" w:tentative="1">
       <w:start w:val="1"/>
       <w:numFmt w:val="bullet"/>
       <w:lvlText w:val="●"/>
@@ -6708,7 +7097,7 @@
         <w:ind w:left="5040" w:hanging="360"/>
       </w:pPr>
     </w:lvl>
-    <w:lvl w:ilvl="7" w15:tentative="1">
+    <w:lvl w:ilvl="7" w:tentative="1">
       <w:start w:val="1"/>
       <w:numFmt w:val="bullet"/>
       <w:lvlText w:val="●"/>
@@ -6717,7 +7106,7 @@
         <w:ind w:left="5760" w:hanging="360"/>
       </w:pPr>
     </w:lvl>
-    <w:lvl w:ilvl="8" w15:tentative="1">
+    <w:lvl w:ilvl="8" w:tentative="1">
       <w:start w:val="1"/>
       <w:numFmt w:val="bullet"/>
       <w:lvlText w:val="●"/>
@@ -6729,7 +7118,7 @@
   </w:abstractNum>
   <w:abstractNum w:abstractNumId="2" w15:restartNumberingAfterBreak="0">
     <w:multiLevelType w:val="hybridMultilevel"/>
-    <w:lvl w:ilvl="0" w15:tentative="1">
+    <w:lvl w:ilvl="0" w:tentative="1">
       <w:start w:val="1"/>
       <w:numFmt w:val="bullet"/>
       <w:lvlText w:val="•"/>
@@ -6744,7 +7133,7 @@
   </w:abstractNum>
   <w:abstractNum w:abstractNumId="3" w15:restartNumberingAfterBreak="0">
     <w:multiLevelType w:val="hybridMultilevel"/>
-    <w:lvl w:ilvl="0" w15:tentative="1">
+    <w:lvl w:ilvl="0" w:tentative="1">
       <w:start w:val="1"/>
       <w:numFmt w:val="decimal"/>
       <w:lvlText w:val="%1."/>
@@ -6793,6 +7182,25 @@
     </w:rPrDefault>
     <w:pPrDefault/>
   </w:docDefaults>
+  <w:style w:type="paragraph" w:styleId="Normal" w:default="1">
+    <w:name w:val="Normal"/>
+    <w:qFormat/>
+  </w:style>
+  <w:style w:type="table" w:styleId="TableNormal" w:default="true">
+    <w:name w:val="Normal Table"/>
+    <w:uiPriority w:val="99"/>
+    <w:semiHidden/>
+    <w:unhideWhenUsed/>
+    <w:tblPr>
+      <w:tblInd w:type="dxa" w:w="0"/>
+      <w:tblCellMar>
+        <w:top w:type="dxa" w:w="0"/>
+        <w:left w:type="dxa" w:w="108"/>
+        <w:bottom w:type="dxa" w:w="0"/>
+        <w:right w:type="dxa" w:w="108"/>
+      </w:tblCellMar>
+    </w:tblPr>
+  </w:style>
   <w:style w:type="paragraph" w:styleId="Title">
     <w:name w:val="Title"/>
     <w:basedOn w:val="Normal"/>
@@ -6801,28 +7209,6 @@
     <w:rPr>
       <w:sz w:val="56"/>
       <w:szCs w:val="56"/>
-    </w:rPr>
-  </w:style>
-  <w:style w:type="paragraph" w:styleId="Heading1">
-    <w:name w:val="Heading 1"/>
-    <w:basedOn w:val="Normal"/>
-    <w:next w:val="Normal"/>
-    <w:qFormat/>
-    <w:rPr>
-      <w:color w:val="2E74B5"/>
-      <w:sz w:val="32"/>
-      <w:szCs w:val="32"/>
-    </w:rPr>
-  </w:style>
-  <w:style w:type="paragraph" w:styleId="Heading2">
-    <w:name w:val="Heading 2"/>
-    <w:basedOn w:val="Normal"/>
-    <w:next w:val="Normal"/>
-    <w:qFormat/>
-    <w:rPr>
-      <w:color w:val="2E74B5"/>
-      <w:sz w:val="26"/>
-      <w:szCs w:val="26"/>
     </w:rPr>
   </w:style>
   <w:style w:type="paragraph" w:styleId="Heading3">
@@ -6927,13 +7313,50 @@
       <w:szCs w:val="20"/>
     </w:rPr>
   </w:style>
+  <w:style w:type="character" w:styleId="EndnoteReference">
+    <w:name w:val="endnote reference"/>
+    <w:basedOn w:val="DefaultParagraphFont"/>
+    <w:uiPriority w:val="99"/>
+    <w:semiHidden/>
+    <w:unhideWhenUsed/>
+    <w:rPr>
+      <w:vertAlign w:val="superscript"/>
+    </w:rPr>
+  </w:style>
+  <w:style w:type="paragraph" w:styleId="EndnoteText">
+    <w:name w:val="endnote text"/>
+    <w:basedOn w:val="Normal"/>
+    <w:link w:val="EndnoteTextChar"/>
+    <w:uiPriority w:val="99"/>
+    <w:semiHidden/>
+    <w:unhideWhenUsed/>
+    <w:pPr>
+      <w:spacing w:after="0" w:line="240" w:lineRule="auto"/>
+    </w:pPr>
+    <w:rPr>
+      <w:sz w:val="20"/>
+      <w:szCs w:val="20"/>
+    </w:rPr>
+  </w:style>
+  <w:style w:type="character" w:styleId="EndnoteTextChar">
+    <w:name w:val="Endnote Text Char"/>
+    <w:basedOn w:val="DefaultParagraphFont"/>
+    <w:link w:val="EndnoteText"/>
+    <w:uiPriority w:val="99"/>
+    <w:semiHidden/>
+    <w:unhideWhenUsed/>
+    <w:rPr>
+      <w:sz w:val="20"/>
+      <w:szCs w:val="20"/>
+    </w:rPr>
+  </w:style>
   <w:style w:type="paragraph" w:styleId="Heading1">
     <w:name w:val="Heading 1"/>
     <w:basedOn w:val="Normal"/>
     <w:next w:val="Normal"/>
     <w:qFormat/>
     <w:pPr>
-      <w:spacing w:before="520" w:after="200"/>
+      <w:spacing w:after="200" w:before="520"/>
       <w:outlineLvl w:val="0"/>
     </w:pPr>
     <w:rPr>
@@ -6949,7 +7372,7 @@
     <w:next w:val="Normal"/>
     <w:qFormat/>
     <w:pPr>
-      <w:spacing w:before="320" w:after="120"/>
+      <w:spacing w:after="120" w:before="320"/>
       <w:outlineLvl w:val="1"/>
     </w:pPr>
     <w:rPr>
@@ -6960,4 +7383,294 @@
     </w:rPr>
   </w:style>
 </w:styles>
+</file>
+
+<file path=word/theme/theme1.xml><?xml version="1.0" encoding="utf-8"?>
+<a:theme xmlns:a="http://schemas.openxmlformats.org/drawingml/2006/main" name="Office Theme">
+  <a:themeElements>
+    <a:clrScheme name="Office">
+      <a:dk1>
+        <a:sysClr val="windowText" lastClr="000000"/>
+      </a:dk1>
+      <a:lt1>
+        <a:sysClr val="window" lastClr="FFFFFF"/>
+      </a:lt1>
+      <a:dk2>
+        <a:srgbClr val="44546A"/>
+      </a:dk2>
+      <a:lt2>
+        <a:srgbClr val="E7E6E6"/>
+      </a:lt2>
+      <a:accent1>
+        <a:srgbClr val="4472C4"/>
+      </a:accent1>
+      <a:accent2>
+        <a:srgbClr val="ED7D31"/>
+      </a:accent2>
+      <a:accent3>
+        <a:srgbClr val="A5A5A5"/>
+      </a:accent3>
+      <a:accent4>
+        <a:srgbClr val="FFC000"/>
+      </a:accent4>
+      <a:accent5>
+        <a:srgbClr val="5B9BD5"/>
+      </a:accent5>
+      <a:accent6>
+        <a:srgbClr val="70AD47"/>
+      </a:accent6>
+      <a:hlink>
+        <a:srgbClr val="0563C1"/>
+      </a:hlink>
+      <a:folHlink>
+        <a:srgbClr val="954F72"/>
+      </a:folHlink>
+    </a:clrScheme>
+    <a:fontScheme name="Office">
+      <a:majorFont>
+        <a:latin typeface="Calibri Light" panose="020F0302020204030204"/>
+        <a:ea typeface=""/>
+        <a:cs typeface=""/>
+        <a:font script="Jpan" typeface="游ゴシック Light"/>
+        <a:font script="Hang" typeface="맑은 고딕"/>
+        <a:font script="Hans" typeface="等线 Light"/>
+        <a:font script="Hant" typeface="新細明體"/>
+        <a:font script="Arab" typeface="Times New Roman"/>
+        <a:font script="Hebr" typeface="Times New Roman"/>
+        <a:font script="Thai" typeface="Angsana New"/>
+        <a:font script="Ethi" typeface="Nyala"/>
+        <a:font script="Beng" typeface="Vrinda"/>
+        <a:font script="Gujr" typeface="Shruti"/>
+        <a:font script="Khmr" typeface="MoolBoran"/>
+        <a:font script="Knda" typeface="Tunga"/>
+        <a:font script="Guru" typeface="Raavi"/>
+        <a:font script="Cans" typeface="Euphemia"/>
+        <a:font script="Cher" typeface="Plantagenet Cherokee"/>
+        <a:font script="Yiii" typeface="Microsoft Yi Baiti"/>
+        <a:font script="Tibt" typeface="Microsoft Himalaya"/>
+        <a:font script="Thaa" typeface="MV Boli"/>
+        <a:font script="Deva" typeface="Mangal"/>
+        <a:font script="Telu" typeface="Gautami"/>
+        <a:font script="Taml" typeface="Latha"/>
+        <a:font script="Syrc" typeface="Estrangelo Edessa"/>
+        <a:font script="Orya" typeface="Kalinga"/>
+        <a:font script="Mlym" typeface="Kartika"/>
+        <a:font script="Laoo" typeface="DokChampa"/>
+        <a:font script="Sinh" typeface="Iskoola Pota"/>
+        <a:font script="Mong" typeface="Mongolian Baiti"/>
+        <a:font script="Viet" typeface="Times New Roman"/>
+        <a:font script="Uigh" typeface="Microsoft Uighur"/>
+        <a:font script="Geor" typeface="Sylfaen"/>
+        <a:font script="Armn" typeface="Arial"/>
+        <a:font script="Bugi" typeface="Leelawadee UI"/>
+        <a:font script="Bopo" typeface="Microsoft JhengHei"/>
+        <a:font script="Java" typeface="Javanese Text"/>
+        <a:font script="Lisu" typeface="Segoe UI"/>
+        <a:font script="Mymr" typeface="Myanmar Text"/>
+        <a:font script="Nkoo" typeface="Ebrima"/>
+        <a:font script="Olck" typeface="Nirmala UI"/>
+        <a:font script="Osma" typeface="Ebrima"/>
+        <a:font script="Phag" typeface="Phagspa"/>
+        <a:font script="Syrn" typeface="Estrangelo Edessa"/>
+        <a:font script="Syrj" typeface="Estrangelo Edessa"/>
+        <a:font script="Syre" typeface="Estrangelo Edessa"/>
+        <a:font script="Sora" typeface="Nirmala UI"/>
+        <a:font script="Tale" typeface="Microsoft Tai Le"/>
+        <a:font script="Talu" typeface="Microsoft New Tai Lue"/>
+        <a:font script="Tfng" typeface="Ebrima"/>
+      </a:majorFont>
+      <a:minorFont>
+        <a:latin typeface="Calibri" panose="020F0502020204030204"/>
+        <a:ea typeface=""/>
+        <a:cs typeface=""/>
+        <a:font script="Jpan" typeface="游明朝"/>
+        <a:font script="Hang" typeface="맑은 고딕"/>
+        <a:font script="Hans" typeface="等线"/>
+        <a:font script="Hant" typeface="新細明體"/>
+        <a:font script="Arab" typeface="Arial"/>
+        <a:font script="Hebr" typeface="Arial"/>
+        <a:font script="Thai" typeface="Cordia New"/>
+        <a:font script="Ethi" typeface="Nyala"/>
+        <a:font script="Beng" typeface="Vrinda"/>
+        <a:font script="Gujr" typeface="Shruti"/>
+        <a:font script="Khmr" typeface="DaunPenh"/>
+        <a:font script="Knda" typeface="Tunga"/>
+        <a:font script="Guru" typeface="Raavi"/>
+        <a:font script="Cans" typeface="Euphemia"/>
+        <a:font script="Cher" typeface="Plantagenet Cherokee"/>
+        <a:font script="Yiii" typeface="Microsoft Yi Baiti"/>
+        <a:font script="Tibt" typeface="Microsoft Himalaya"/>
+        <a:font script="Thaa" typeface="MV Boli"/>
+        <a:font script="Deva" typeface="Mangal"/>
+        <a:font script="Telu" typeface="Gautami"/>
+        <a:font script="Taml" typeface="Latha"/>
+        <a:font script="Syrc" typeface="Estrangelo Edessa"/>
+        <a:font script="Orya" typeface="Kalinga"/>
+        <a:font script="Mlym" typeface="Kartika"/>
+        <a:font script="Laoo" typeface="DokChampa"/>
+        <a:font script="Sinh" typeface="Iskoola Pota"/>
+        <a:font script="Mong" typeface="Mongolian Baiti"/>
+        <a:font script="Viet" typeface="Arial"/>
+        <a:font script="Uigh" typeface="Microsoft Uighur"/>
+        <a:font script="Geor" typeface="Sylfaen"/>
+        <a:font script="Armn" typeface="Arial"/>
+        <a:font script="Bugi" typeface="Leelawadee UI"/>
+        <a:font script="Bopo" typeface="Microsoft JhengHei"/>
+        <a:font script="Java" typeface="Javanese Text"/>
+        <a:font script="Lisu" typeface="Segoe UI"/>
+        <a:font script="Mymr" typeface="Myanmar Text"/>
+        <a:font script="Nkoo" typeface="Ebrima"/>
+        <a:font script="Olck" typeface="Nirmala UI"/>
+        <a:font script="Osma" typeface="Ebrima"/>
+        <a:font script="Phag" typeface="Phagspa"/>
+        <a:font script="Syrn" typeface="Estrangelo Edessa"/>
+        <a:font script="Syrj" typeface="Estrangelo Edessa"/>
+        <a:font script="Syre" typeface="Estrangelo Edessa"/>
+        <a:font script="Sora" typeface="Nirmala UI"/>
+        <a:font script="Tale" typeface="Microsoft Tai Le"/>
+        <a:font script="Talu" typeface="Microsoft New Tai Lue"/>
+        <a:font script="Tfng" typeface="Ebrima"/>
+      </a:minorFont>
+    </a:fontScheme>
+    <a:fmtScheme name="Office">
+      <a:fillStyleLst>
+        <a:solidFill>
+          <a:schemeClr val="phClr"/>
+        </a:solidFill>
+        <a:gradFill rotWithShape="true">
+          <a:gsLst>
+            <a:gs pos="0">
+              <a:schemeClr val="phClr">
+                <a:lumMod val="110000"/>
+                <a:satMod val="105000"/>
+                <a:tint val="67000"/>
+              </a:schemeClr>
+            </a:gs>
+            <a:gs pos="50000">
+              <a:schemeClr val="phClr">
+                <a:lumMod val="105000"/>
+                <a:satMod val="103000"/>
+                <a:tint val="73000"/>
+              </a:schemeClr>
+            </a:gs>
+            <a:gs pos="100000">
+              <a:schemeClr val="phClr">
+                <a:lumMod val="105000"/>
+                <a:satMod val="109000"/>
+                <a:tint val="81000"/>
+              </a:schemeClr>
+            </a:gs>
+          </a:gsLst>
+          <a:lin ang="5400000" scaled="false"/>
+        </a:gradFill>
+        <a:gradFill rotWithShape="true">
+          <a:gsLst>
+            <a:gs pos="0">
+              <a:schemeClr val="phClr">
+                <a:satMod val="103000"/>
+                <a:lumMod val="102000"/>
+                <a:tint val="94000"/>
+              </a:schemeClr>
+            </a:gs>
+            <a:gs pos="50000">
+              <a:schemeClr val="phClr">
+                <a:satMod val="110000"/>
+                <a:lumMod val="100000"/>
+                <a:shade val="100000"/>
+              </a:schemeClr>
+            </a:gs>
+            <a:gs pos="100000">
+              <a:schemeClr val="phClr">
+                <a:lumMod val="99000"/>
+                <a:satMod val="120000"/>
+                <a:shade val="78000"/>
+              </a:schemeClr>
+            </a:gs>
+          </a:gsLst>
+          <a:lin ang="5400000" scaled="false"/>
+        </a:gradFill>
+      </a:fillStyleLst>
+      <a:lnStyleLst>
+        <a:ln w="6350" cap="flat" cmpd="sng" algn="ctr">
+          <a:solidFill>
+            <a:schemeClr val="phClr"/>
+          </a:solidFill>
+          <a:prstDash val="solid"/>
+          <a:miter lim="800000"/>
+        </a:ln>
+        <a:ln w="12700" cap="flat" cmpd="sng" algn="ctr">
+          <a:solidFill>
+            <a:schemeClr val="phClr"/>
+          </a:solidFill>
+          <a:prstDash val="solid"/>
+          <a:miter lim="800000"/>
+        </a:ln>
+        <a:ln w="19050" cap="flat" cmpd="sng" algn="ctr">
+          <a:solidFill>
+            <a:schemeClr val="phClr"/>
+          </a:solidFill>
+          <a:prstDash val="solid"/>
+          <a:miter lim="800000"/>
+        </a:ln>
+      </a:lnStyleLst>
+      <a:effectStyleLst>
+        <a:effectStyle>
+          <a:effectLst/>
+        </a:effectStyle>
+        <a:effectStyle>
+          <a:effectLst/>
+        </a:effectStyle>
+        <a:effectStyle>
+          <a:effectLst>
+            <a:outerShdw blurRad="57150" dist="19050" dir="5400000" algn="ctr" rotWithShape="false">
+              <a:srgbClr val="000000">
+                <a:alpha val="63000"/>
+              </a:srgbClr>
+            </a:outerShdw>
+          </a:effectLst>
+        </a:effectStyle>
+      </a:effectStyleLst>
+      <a:bgFillStyleLst>
+        <a:solidFill>
+          <a:schemeClr val="phClr"/>
+        </a:solidFill>
+        <a:solidFill>
+          <a:schemeClr val="phClr">
+            <a:tint val="95000"/>
+            <a:satMod val="170000"/>
+          </a:schemeClr>
+        </a:solidFill>
+        <a:gradFill rotWithShape="true">
+          <a:gsLst>
+            <a:gs pos="0">
+              <a:schemeClr val="phClr">
+                <a:tint val="93000"/>
+                <a:satMod val="150000"/>
+                <a:shade val="98000"/>
+                <a:lumMod val="102000"/>
+              </a:schemeClr>
+            </a:gs>
+            <a:gs pos="50000">
+              <a:schemeClr val="phClr">
+                <a:tint val="98000"/>
+                <a:satMod val="130000"/>
+                <a:shade val="90000"/>
+                <a:lumMod val="103000"/>
+              </a:schemeClr>
+            </a:gs>
+            <a:gs pos="100000">
+              <a:schemeClr val="phClr">
+                <a:shade val="63000"/>
+                <a:satMod val="120000"/>
+              </a:schemeClr>
+            </a:gs>
+          </a:gsLst>
+          <a:lin ang="5400000" scaled="false"/>
+        </a:gradFill>
+      </a:bgFillStyleLst>
+    </a:fmtScheme>
+  </a:themeElements>
+  <a:objectDefaults/>
+  <a:extraClrSchemeLst/>
+</a:theme>
 </file>
</xml_diff>

<commit_message>
deck: final pitch deck (7 slides, talk track in notes, PDB structure animations) with its build script; How we did it adds the 3D structures, phone layout and current commits
Co-Authored-By: Claude Opus 5.5 <noreply@anthropic.com>
</commit_message>
<xml_diff>
--- a/docs/how_we_did_it/Needle_in_the_Haystack_How_We_Did_It.docx
+++ b/docs/how_we_did_it/Needle_in_the_Haystack_How_We_Did_It.docx
@@ -1425,7 +1425,7 @@
                 <w:sz w:val="17"/>
                 <w:szCs w:val="17"/>
               </w:rPr>
-              <w:t xml:space="preserve">python-pptx and PowerPoint</w:t>
+              <w:t xml:space="preserve">3Dmol.js and the Protein Data Bank</w:t>
             </w:r>
           </w:p>
         </w:tc>
@@ -1459,7 +1459,80 @@
                 <w:sz w:val="17"/>
                 <w:szCs w:val="17"/>
               </w:rPr>
-              <w:t xml:space="preserve">Built the seven-slide pitch deck from code in the product's theme, with every number on a slide linked to its filing page. Review renders were exported through PowerPoint itself, because LibreOffice swapped in other fonts and misreported the layout.</w:t>
+              <w:t xml:space="preserve">Renders the rotating crystal structure above each drug in the product comparison, from PDB files served with the page. The deck shows the same structures as looping animations.</w:t>
+            </w:r>
+          </w:p>
+        </w:tc>
+      </w:tr>
+      <w:tr>
+        <w:trPr>
+          <w:cantSplit/>
+        </w:trPr>
+        <w:tc>
+          <w:tcPr>
+            <w:tcW w:type="dxa" w:w="3024"/>
+            <w:tcBorders>
+              <w:top w:val="single" w:color="D9D6CE" w:sz="4"/>
+              <w:left w:val="none" w:color="FFFFFF" w:sz="0"/>
+              <w:bottom w:val="single" w:color="D9D6CE" w:sz="4"/>
+              <w:right w:val="none" w:color="FFFFFF" w:sz="0"/>
+            </w:tcBorders>
+            <w:tcMar>
+              <w:top w:type="dxa" w:w="70"/>
+              <w:left w:type="dxa" w:w="90"/>
+              <w:bottom w:type="dxa" w:w="70"/>
+              <w:right w:type="dxa" w:w="90"/>
+            </w:tcMar>
+            <w:vAlign w:val="top"/>
+          </w:tcPr>
+          <w:p>
+            <w:pPr>
+              <w:spacing w:after="0" w:line="250"/>
+            </w:pPr>
+            <w:r>
+              <w:rPr>
+                <w:rFonts w:ascii="Arial" w:cs="Arial" w:eastAsia="Arial" w:hAnsi="Arial"/>
+                <w:b w:val="false"/>
+                <w:bCs w:val="false"/>
+                <w:color w:val="141413"/>
+                <w:sz w:val="17"/>
+                <w:szCs w:val="17"/>
+              </w:rPr>
+              <w:t xml:space="preserve">python-pptx and PowerPoint</w:t>
+            </w:r>
+          </w:p>
+        </w:tc>
+        <w:tc>
+          <w:tcPr>
+            <w:tcW w:type="dxa" w:w="6624"/>
+            <w:tcBorders>
+              <w:top w:val="single" w:color="D9D6CE" w:sz="4"/>
+              <w:left w:val="none" w:color="FFFFFF" w:sz="0"/>
+              <w:bottom w:val="single" w:color="D9D6CE" w:sz="4"/>
+              <w:right w:val="none" w:color="FFFFFF" w:sz="0"/>
+            </w:tcBorders>
+            <w:tcMar>
+              <w:top w:type="dxa" w:w="70"/>
+              <w:left w:type="dxa" w:w="90"/>
+              <w:bottom w:type="dxa" w:w="70"/>
+              <w:right w:type="dxa" w:w="90"/>
+            </w:tcMar>
+            <w:vAlign w:val="top"/>
+          </w:tcPr>
+          <w:p>
+            <w:pPr>
+              <w:spacing w:after="0" w:line="250"/>
+            </w:pPr>
+            <w:r>
+              <w:rPr>
+                <w:rFonts w:ascii="Arial" w:cs="Arial" w:eastAsia="Arial" w:hAnsi="Arial"/>
+                <w:b w:val="false"/>
+                <w:bCs w:val="false"/>
+                <w:color w:val="141413"/>
+                <w:sz w:val="17"/>
+                <w:szCs w:val="17"/>
+              </w:rPr>
+              <w:t xml:space="preserve">Built the seven-slide pitch deck from code in the product's theme, with every number on a slide linked to its filing page and a two-person talk track in the speaker notes. Review renders were exported through PowerPoint itself, because LibreOffice swapped in other fonts and misreported the layout.</w:t>
             </w:r>
           </w:p>
         </w:tc>
@@ -3573,7 +3646,7 @@
           <w:sz w:val="21"/>
           <w:szCs w:val="21"/>
         </w:rPr>
-        <w:t xml:space="preserve">The last morning went into making the work easy for a judge to read without changing a single cited number. The chat took the name Needle in the Haystack and a haystack theme, and its two prompts were relabelled Find the needle and The CEO Move, with the case's own Part 1 and Part 2 kept beside them on the slides. Answers now open with what the case grades first. The product answer leads with what limits growth and the tie to the numbers, and the CEO Move leads with what it should return. When that summary started repeating the detail below it, the expandable section was cut back to only what the summary leaves out.</w:t>
+        <w:t xml:space="preserve">The last morning went into making the work easy for a judge to read without changing a single cited number. The chat took the name Needle in the Haystack and a haystack theme, and its two prompts were relabelled Find the needle and The CEO Move, with the case's own Part 1 and Part 2 kept beside them on the slides. Answers now open with what the case grades first. The product answer leads with what limits growth and the tie to the numbers, and the CEO Move leads with what it should return. When that summary started repeating the detail below it, the expandable section was cut back to only what the summary leaves out. Each drug in the product comparison now carries a slowly rotating 3D structure from the Protein Data Bank, captioned with what it shows and linked to its entry. These are experimental crystal structures, not AlphaFold models, and where a drug has no public structure of its own the card shows its target and says so. A phone pass then stacked the findings table into cards under 640 pixels, so nothing needs a sideways scroll.</w:t>
       </w:r>
     </w:p>
     <w:p>
@@ -6877,7 +6950,7 @@
           <w:sz w:val="16"/>
           <w:szCs w:val="16"/>
         </w:rPr>
-        <w:t xml:space="preserve">Repository: aidanmcjones/neeley-ai-forward. Final commits: data-moat ce3c0f2, ui 9f064c4, quant-model at the commit that carries this report. Public demo: aidanmcjones.github.io/needle-demo. Sealed selection sha256 903fc656fa7a1d1b2bdf303d8d8f9321d5f1f7b741f6b751c4cdf4f9c40c8fa7.</w:t>
+        <w:t xml:space="preserve">Repository: aidanmcjones/neeley-ai-forward. Final commits: data-moat ce3c0f2, ui 9f26e63, quant-model at the commit that carries this report, which also holds the deck under deck/. Public demo: aidanmcjones.github.io/needle-demo (repository aidanmcjones/needle-demo). Sealed selection sha256 903fc656fa7a1d1b2bdf303d8d8f9321d5f1f7b741f6b751c4cdf4f9c40c8fa7.</w:t>
       </w:r>
     </w:p>
     <w:sectPr>

</xml_diff>